<commit_message>
Update Ejercicios Tienda FP teCHSTORE.docx
</commit_message>
<xml_diff>
--- a/MF0964_3 Desarrollo de elementos software para gestión de/SQL/Ejercicios Tienda FP teCHSTORE.docx
+++ b/MF0964_3 Desarrollo de elementos software para gestión de/SQL/Ejercicios Tienda FP teCHSTORE.docx
@@ -152,54 +152,86 @@
         <w:rPr>
           <w:lang w:val="en-GB"/>
         </w:rPr>
-        <w:t>DROP DATABASE IF EXISTS techstore_fp;</w:t>
-      </w:r>
-    </w:p>
-    <w:p>
-      <w:pPr>
-        <w:rPr>
-          <w:lang w:val="en-GB"/>
-        </w:rPr>
-      </w:pPr>
-      <w:r>
-        <w:rPr>
-          <w:lang w:val="en-GB"/>
-        </w:rPr>
-        <w:t>CREATE DATABASE techstore_fp CHARACTER SET utf8mb4 COLLATE utf8mb4_unicode_ci;</w:t>
-      </w:r>
-    </w:p>
-    <w:p>
-      <w:pPr>
-        <w:rPr>
-          <w:lang w:val="en-GB"/>
-        </w:rPr>
-      </w:pPr>
-      <w:r>
-        <w:rPr>
-          <w:lang w:val="en-GB"/>
-        </w:rPr>
-        <w:t>USE techstore_fp;</w:t>
-      </w:r>
-    </w:p>
-    <w:p>
-      <w:pPr>
-        <w:rPr>
-          <w:lang w:val="en-GB"/>
-        </w:rPr>
-      </w:pPr>
-    </w:p>
-    <w:p>
-      <w:pPr>
-        <w:rPr>
-          <w:lang w:val="en-GB"/>
-        </w:rPr>
-      </w:pPr>
-      <w:r>
-        <w:rPr>
-          <w:lang w:val="en-GB"/>
-        </w:rPr>
-        <w:t>SET FOREIGN_KEY_CHECKS=0;</w:t>
-      </w:r>
+        <w:t>DROP DATABASE IF EXISTS techstore_</w:t>
+      </w:r>
+      <w:proofErr w:type="gramStart"/>
+      <w:r>
+        <w:rPr>
+          <w:lang w:val="en-GB"/>
+        </w:rPr>
+        <w:t>fp;</w:t>
+      </w:r>
+      <w:proofErr w:type="gramEnd"/>
+    </w:p>
+    <w:p>
+      <w:pPr>
+        <w:rPr>
+          <w:lang w:val="en-GB"/>
+        </w:rPr>
+      </w:pPr>
+      <w:r>
+        <w:rPr>
+          <w:lang w:val="en-GB"/>
+        </w:rPr>
+        <w:t>CREATE DATABASE techstore_fp CHARACTER SET utf8mb4 COLLATE utf8mb4_unicode_</w:t>
+      </w:r>
+      <w:proofErr w:type="gramStart"/>
+      <w:r>
+        <w:rPr>
+          <w:lang w:val="en-GB"/>
+        </w:rPr>
+        <w:t>ci;</w:t>
+      </w:r>
+      <w:proofErr w:type="gramEnd"/>
+    </w:p>
+    <w:p>
+      <w:pPr>
+        <w:rPr>
+          <w:lang w:val="en-GB"/>
+        </w:rPr>
+      </w:pPr>
+      <w:r>
+        <w:rPr>
+          <w:lang w:val="en-GB"/>
+        </w:rPr>
+        <w:t>USE techstore_</w:t>
+      </w:r>
+      <w:proofErr w:type="gramStart"/>
+      <w:r>
+        <w:rPr>
+          <w:lang w:val="en-GB"/>
+        </w:rPr>
+        <w:t>fp;</w:t>
+      </w:r>
+      <w:proofErr w:type="gramEnd"/>
+    </w:p>
+    <w:p>
+      <w:pPr>
+        <w:rPr>
+          <w:lang w:val="en-GB"/>
+        </w:rPr>
+      </w:pPr>
+    </w:p>
+    <w:p>
+      <w:pPr>
+        <w:rPr>
+          <w:lang w:val="en-GB"/>
+        </w:rPr>
+      </w:pPr>
+      <w:r>
+        <w:rPr>
+          <w:lang w:val="en-GB"/>
+        </w:rPr>
+        <w:t>SET FOREIGN_KEY_CHECKS=</w:t>
+      </w:r>
+      <w:proofErr w:type="gramStart"/>
+      <w:r>
+        <w:rPr>
+          <w:lang w:val="en-GB"/>
+        </w:rPr>
+        <w:t>0;</w:t>
+      </w:r>
+      <w:proofErr w:type="gramEnd"/>
     </w:p>
     <w:p>
       <w:pPr>
@@ -231,60 +263,100 @@
         <w:rPr>
           <w:lang w:val="en-GB"/>
         </w:rPr>
-        <w:t>DROP TABLE IF EXISTS detalle_venta;</w:t>
-      </w:r>
-    </w:p>
-    <w:p>
-      <w:pPr>
-        <w:rPr>
-          <w:lang w:val="en-GB"/>
-        </w:rPr>
-      </w:pPr>
-      <w:r>
-        <w:rPr>
-          <w:lang w:val="en-GB"/>
-        </w:rPr>
-        <w:t>DROP TABLE IF EXISTS ventas;</w:t>
-      </w:r>
-    </w:p>
-    <w:p>
-      <w:pPr>
-        <w:rPr>
-          <w:lang w:val="en-GB"/>
-        </w:rPr>
-      </w:pPr>
-      <w:r>
-        <w:rPr>
-          <w:lang w:val="en-GB"/>
-        </w:rPr>
-        <w:t>DROP TABLE IF EXISTS productos;</w:t>
-      </w:r>
-    </w:p>
-    <w:p>
-      <w:pPr>
-        <w:rPr>
-          <w:lang w:val="en-GB"/>
-        </w:rPr>
-      </w:pPr>
-      <w:r>
-        <w:rPr>
-          <w:lang w:val="en-GB"/>
-        </w:rPr>
-        <w:t>DROP TABLE IF EXISTS categorias;</w:t>
-      </w:r>
-    </w:p>
-    <w:p>
-      <w:pPr>
-        <w:rPr>
-          <w:lang w:val="en-GB"/>
-        </w:rPr>
-      </w:pPr>
-      <w:r>
-        <w:rPr>
-          <w:lang w:val="en-GB"/>
-        </w:rPr>
-        <w:t>DROP TABLE IF EXISTS clientes;</w:t>
-      </w:r>
+        <w:t>DROP TABLE IF EXISTS detalle_</w:t>
+      </w:r>
+      <w:proofErr w:type="gramStart"/>
+      <w:r>
+        <w:rPr>
+          <w:lang w:val="en-GB"/>
+        </w:rPr>
+        <w:t>venta;</w:t>
+      </w:r>
+      <w:proofErr w:type="gramEnd"/>
+    </w:p>
+    <w:p>
+      <w:pPr>
+        <w:rPr>
+          <w:lang w:val="en-GB"/>
+        </w:rPr>
+      </w:pPr>
+      <w:r>
+        <w:rPr>
+          <w:lang w:val="en-GB"/>
+        </w:rPr>
+        <w:t xml:space="preserve">DROP TABLE IF EXISTS </w:t>
+      </w:r>
+      <w:proofErr w:type="gramStart"/>
+      <w:r>
+        <w:rPr>
+          <w:lang w:val="en-GB"/>
+        </w:rPr>
+        <w:t>ventas;</w:t>
+      </w:r>
+      <w:proofErr w:type="gramEnd"/>
+    </w:p>
+    <w:p>
+      <w:pPr>
+        <w:rPr>
+          <w:lang w:val="en-GB"/>
+        </w:rPr>
+      </w:pPr>
+      <w:r>
+        <w:rPr>
+          <w:lang w:val="en-GB"/>
+        </w:rPr>
+        <w:t xml:space="preserve">DROP TABLE IF EXISTS </w:t>
+      </w:r>
+      <w:proofErr w:type="gramStart"/>
+      <w:r>
+        <w:rPr>
+          <w:lang w:val="en-GB"/>
+        </w:rPr>
+        <w:t>productos;</w:t>
+      </w:r>
+      <w:proofErr w:type="gramEnd"/>
+    </w:p>
+    <w:p>
+      <w:pPr>
+        <w:rPr>
+          <w:lang w:val="en-GB"/>
+        </w:rPr>
+      </w:pPr>
+      <w:r>
+        <w:rPr>
+          <w:lang w:val="en-GB"/>
+        </w:rPr>
+        <w:t xml:space="preserve">DROP TABLE IF EXISTS </w:t>
+      </w:r>
+      <w:proofErr w:type="gramStart"/>
+      <w:r>
+        <w:rPr>
+          <w:lang w:val="en-GB"/>
+        </w:rPr>
+        <w:t>categorias;</w:t>
+      </w:r>
+      <w:proofErr w:type="gramEnd"/>
+    </w:p>
+    <w:p>
+      <w:pPr>
+        <w:rPr>
+          <w:lang w:val="en-GB"/>
+        </w:rPr>
+      </w:pPr>
+      <w:r>
+        <w:rPr>
+          <w:lang w:val="en-GB"/>
+        </w:rPr>
+        <w:t xml:space="preserve">DROP TABLE IF EXISTS </w:t>
+      </w:r>
+      <w:proofErr w:type="gramStart"/>
+      <w:r>
+        <w:rPr>
+          <w:lang w:val="en-GB"/>
+        </w:rPr>
+        <w:t>clientes;</w:t>
+      </w:r>
+      <w:proofErr w:type="gramEnd"/>
     </w:p>
     <w:p>
       <w:pPr>
@@ -327,12 +399,28 @@
         <w:t xml:space="preserve">  </w:t>
       </w:r>
       <w:r>
-        <w:t>nombre VARCHAR(60) NOT NULL,</w:t>
-      </w:r>
-    </w:p>
-    <w:p>
-      <w:r>
-        <w:t xml:space="preserve">  email VARCHAR(80),</w:t>
+        <w:t xml:space="preserve">nombre </w:t>
+      </w:r>
+      <w:proofErr w:type="gramStart"/>
+      <w:r>
+        <w:t>VARCHAR(</w:t>
+      </w:r>
+      <w:proofErr w:type="gramEnd"/>
+      <w:r>
+        <w:t>60) NOT NULL,</w:t>
+      </w:r>
+    </w:p>
+    <w:p>
+      <w:r>
+        <w:t xml:space="preserve">  email </w:t>
+      </w:r>
+      <w:proofErr w:type="gramStart"/>
+      <w:r>
+        <w:t>VARCHAR(</w:t>
+      </w:r>
+      <w:proofErr w:type="gramEnd"/>
+      <w:r>
+        <w:t>80),</w:t>
       </w:r>
     </w:p>
     <w:p>
@@ -346,12 +434,28 @@
       </w:r>
       <w:proofErr w:type="spellEnd"/>
       <w:r>
-        <w:t xml:space="preserve"> VARCHAR(15),</w:t>
-      </w:r>
-    </w:p>
-    <w:p>
-      <w:r>
-        <w:t xml:space="preserve">  ciudad VARCHAR(40),</w:t>
+        <w:t xml:space="preserve"> </w:t>
+      </w:r>
+      <w:proofErr w:type="gramStart"/>
+      <w:r>
+        <w:t>VARCHAR(</w:t>
+      </w:r>
+      <w:proofErr w:type="gramEnd"/>
+      <w:r>
+        <w:t>15),</w:t>
+      </w:r>
+    </w:p>
+    <w:p>
+      <w:r>
+        <w:t xml:space="preserve">  ciudad </w:t>
+      </w:r>
+      <w:proofErr w:type="gramStart"/>
+      <w:r>
+        <w:t>VARCHAR(</w:t>
+      </w:r>
+      <w:proofErr w:type="gramEnd"/>
+      <w:r>
+        <w:t>40),</w:t>
       </w:r>
     </w:p>
     <w:p>
@@ -373,12 +477,14 @@
           <w:lang w:val="en-GB"/>
         </w:rPr>
       </w:pPr>
+      <w:proofErr w:type="gramStart"/>
       <w:r>
         <w:rPr>
           <w:lang w:val="en-GB"/>
         </w:rPr>
         <w:t>);</w:t>
       </w:r>
+      <w:proofErr w:type="gramEnd"/>
     </w:p>
     <w:p>
       <w:pPr>
@@ -423,21 +529,37 @@
         <w:rPr>
           <w:lang w:val="en-GB"/>
         </w:rPr>
-        <w:t xml:space="preserve">  nombre VARCHAR(40) NOT NULL UNIQUE</w:t>
-      </w:r>
-    </w:p>
-    <w:p>
-      <w:pPr>
-        <w:rPr>
-          <w:lang w:val="en-GB"/>
-        </w:rPr>
-      </w:pPr>
+        <w:t xml:space="preserve">  nombre </w:t>
+      </w:r>
+      <w:proofErr w:type="gramStart"/>
+      <w:r>
+        <w:rPr>
+          <w:lang w:val="en-GB"/>
+        </w:rPr>
+        <w:t>VARCHAR(</w:t>
+      </w:r>
+      <w:proofErr w:type="gramEnd"/>
+      <w:r>
+        <w:rPr>
+          <w:lang w:val="en-GB"/>
+        </w:rPr>
+        <w:t>40) NOT NULL UNIQUE</w:t>
+      </w:r>
+    </w:p>
+    <w:p>
+      <w:pPr>
+        <w:rPr>
+          <w:lang w:val="en-GB"/>
+        </w:rPr>
+      </w:pPr>
+      <w:proofErr w:type="gramStart"/>
       <w:r>
         <w:rPr>
           <w:lang w:val="en-GB"/>
         </w:rPr>
         <w:t>);</w:t>
       </w:r>
+      <w:proofErr w:type="gramEnd"/>
     </w:p>
     <w:p>
       <w:pPr>
@@ -482,20 +604,48 @@
         <w:rPr>
           <w:lang w:val="en-GB"/>
         </w:rPr>
-        <w:t xml:space="preserve">  nombre VARCHAR(80) NOT NULL,</w:t>
-      </w:r>
-    </w:p>
-    <w:p>
-      <w:pPr>
-        <w:rPr>
-          <w:lang w:val="en-GB"/>
-        </w:rPr>
-      </w:pPr>
-      <w:r>
-        <w:rPr>
-          <w:lang w:val="en-GB"/>
-        </w:rPr>
-        <w:t xml:space="preserve">  precio DECIMAL(10,2) NOT NULL,</w:t>
+        <w:t xml:space="preserve">  nombre </w:t>
+      </w:r>
+      <w:proofErr w:type="gramStart"/>
+      <w:r>
+        <w:rPr>
+          <w:lang w:val="en-GB"/>
+        </w:rPr>
+        <w:t>VARCHAR(</w:t>
+      </w:r>
+      <w:proofErr w:type="gramEnd"/>
+      <w:r>
+        <w:rPr>
+          <w:lang w:val="en-GB"/>
+        </w:rPr>
+        <w:t>80) NOT NULL,</w:t>
+      </w:r>
+    </w:p>
+    <w:p>
+      <w:pPr>
+        <w:rPr>
+          <w:lang w:val="en-GB"/>
+        </w:rPr>
+      </w:pPr>
+      <w:r>
+        <w:rPr>
+          <w:lang w:val="en-GB"/>
+        </w:rPr>
+        <w:t xml:space="preserve">  precio </w:t>
+      </w:r>
+      <w:proofErr w:type="gramStart"/>
+      <w:r>
+        <w:rPr>
+          <w:lang w:val="en-GB"/>
+        </w:rPr>
+        <w:t>DECIMAL(</w:t>
+      </w:r>
+      <w:proofErr w:type="gramEnd"/>
+      <w:r>
+        <w:rPr>
+          <w:lang w:val="en-GB"/>
+        </w:rPr>
+        <w:t>10,2) NOT NULL,</w:t>
       </w:r>
     </w:p>
     <w:p>
@@ -543,12 +693,14 @@
           <w:lang w:val="en-GB"/>
         </w:rPr>
       </w:pPr>
+      <w:proofErr w:type="gramStart"/>
       <w:r>
         <w:rPr>
           <w:lang w:val="en-GB"/>
         </w:rPr>
         <w:t>);</w:t>
       </w:r>
+      <w:proofErr w:type="gramEnd"/>
     </w:p>
     <w:p>
       <w:pPr>
@@ -647,12 +799,14 @@
           <w:lang w:val="en-GB"/>
         </w:rPr>
       </w:pPr>
+      <w:proofErr w:type="gramStart"/>
       <w:r>
         <w:rPr>
           <w:lang w:val="en-GB"/>
         </w:rPr>
         <w:t>);</w:t>
       </w:r>
+      <w:proofErr w:type="gramEnd"/>
     </w:p>
     <w:p>
       <w:pPr>
@@ -727,7 +881,15 @@
       </w:r>
       <w:proofErr w:type="spellEnd"/>
       <w:r>
-        <w:t xml:space="preserve"> DECIMAL(10,2) NOT NULL,</w:t>
+        <w:t xml:space="preserve"> </w:t>
+      </w:r>
+      <w:proofErr w:type="gramStart"/>
+      <w:r>
+        <w:t>DECIMAL(</w:t>
+      </w:r>
+      <w:proofErr w:type="gramEnd"/>
+      <w:r>
+        <w:t>10,2) NOT NULL,</w:t>
       </w:r>
     </w:p>
     <w:p>
@@ -799,32 +961,221 @@
           <w:lang w:val="en-GB"/>
         </w:rPr>
       </w:pPr>
+      <w:proofErr w:type="gramStart"/>
       <w:r>
         <w:rPr>
           <w:lang w:val="en-GB"/>
         </w:rPr>
         <w:t>);</w:t>
       </w:r>
-    </w:p>
-    <w:p>
-      <w:pPr>
-        <w:rPr>
-          <w:lang w:val="en-GB"/>
-        </w:rPr>
-      </w:pPr>
-    </w:p>
-    <w:p>
-      <w:pPr>
-        <w:rPr>
-          <w:lang w:val="en-GB"/>
-        </w:rPr>
-      </w:pPr>
-      <w:r>
-        <w:rPr>
-          <w:lang w:val="en-GB"/>
-        </w:rPr>
-        <w:t>SET FOREIGN_KEY_CHECKS=1;</w:t>
-      </w:r>
+      <w:proofErr w:type="gramEnd"/>
+    </w:p>
+    <w:p>
+      <w:pPr>
+        <w:rPr>
+          <w:lang w:val="en-GB"/>
+        </w:rPr>
+      </w:pPr>
+    </w:p>
+    <w:p>
+      <w:pPr>
+        <w:rPr>
+          <w:lang w:val="en-GB"/>
+        </w:rPr>
+      </w:pPr>
+      <w:r>
+        <w:rPr>
+          <w:lang w:val="en-GB"/>
+        </w:rPr>
+        <w:t>SET FOREIGN_KEY_CHECKS=</w:t>
+      </w:r>
+      <w:proofErr w:type="gramStart"/>
+      <w:r>
+        <w:rPr>
+          <w:lang w:val="en-GB"/>
+        </w:rPr>
+        <w:t>1;</w:t>
+      </w:r>
+      <w:proofErr w:type="gramEnd"/>
+    </w:p>
+    <w:p>
+      <w:pPr>
+        <w:rPr>
+          <w:lang w:val="en-GB"/>
+        </w:rPr>
+      </w:pPr>
+    </w:p>
+    <w:p>
+      <w:pPr>
+        <w:rPr>
+          <w:lang w:val="en-GB"/>
+        </w:rPr>
+      </w:pPr>
+      <w:r>
+        <w:rPr>
+          <w:lang w:val="en-GB"/>
+        </w:rPr>
+        <w:t>MODIFICAR LAS RELACIONES</w:t>
+      </w:r>
+    </w:p>
+    <w:p>
+      <w:pPr>
+        <w:rPr>
+          <w:lang w:val="en-GB"/>
+        </w:rPr>
+      </w:pPr>
+      <w:r>
+        <w:rPr>
+          <w:lang w:val="en-GB"/>
+        </w:rPr>
+        <w:t xml:space="preserve">ALTER TABLE </w:t>
+      </w:r>
+      <w:proofErr w:type="spellStart"/>
+      <w:r>
+        <w:rPr>
+          <w:lang w:val="en-GB"/>
+        </w:rPr>
+        <w:t>Tabla</w:t>
+      </w:r>
+      <w:proofErr w:type="spellEnd"/>
+      <w:r>
+        <w:rPr>
+          <w:lang w:val="en-GB"/>
+        </w:rPr>
+        <w:t xml:space="preserve"> add const</w:t>
+      </w:r>
+      <w:r>
+        <w:rPr>
+          <w:lang w:val="en-GB"/>
+        </w:rPr>
+        <w:t>raint</w:t>
+      </w:r>
+    </w:p>
+    <w:p>
+      <w:pPr>
+        <w:rPr>
+          <w:lang w:val="en-GB"/>
+        </w:rPr>
+      </w:pPr>
+      <w:proofErr w:type="spellStart"/>
+      <w:r>
+        <w:rPr>
+          <w:lang w:val="en-GB"/>
+        </w:rPr>
+        <w:t>Nombre_</w:t>
+      </w:r>
+      <w:proofErr w:type="gramStart"/>
+      <w:r>
+        <w:rPr>
+          <w:lang w:val="en-GB"/>
+        </w:rPr>
+        <w:t>restriccion</w:t>
+      </w:r>
+      <w:proofErr w:type="spellEnd"/>
+      <w:r>
+        <w:rPr>
+          <w:lang w:val="en-GB"/>
+        </w:rPr>
+        <w:t>(</w:t>
+      </w:r>
+      <w:proofErr w:type="spellStart"/>
+      <w:proofErr w:type="gramEnd"/>
+      <w:r>
+        <w:rPr>
+          <w:lang w:val="en-GB"/>
+        </w:rPr>
+        <w:t>nombre</w:t>
+      </w:r>
+      <w:proofErr w:type="spellEnd"/>
+      <w:r>
+        <w:rPr>
+          <w:lang w:val="en-GB"/>
+        </w:rPr>
+        <w:t xml:space="preserve"> </w:t>
+      </w:r>
+      <w:proofErr w:type="spellStart"/>
+      <w:r>
+        <w:rPr>
+          <w:lang w:val="en-GB"/>
+        </w:rPr>
+        <w:t>inventado</w:t>
+      </w:r>
+      <w:proofErr w:type="spellEnd"/>
+      <w:r>
+        <w:rPr>
+          <w:lang w:val="en-GB"/>
+        </w:rPr>
+        <w:t>)</w:t>
+      </w:r>
+    </w:p>
+    <w:p>
+      <w:pPr>
+        <w:rPr>
+          <w:lang w:val="en-GB"/>
+        </w:rPr>
+      </w:pPr>
+      <w:r>
+        <w:rPr>
+          <w:lang w:val="en-GB"/>
+        </w:rPr>
+        <w:t xml:space="preserve">  FOREIGN KEY (</w:t>
+      </w:r>
+      <w:proofErr w:type="spellStart"/>
+      <w:r>
+        <w:rPr>
+          <w:lang w:val="en-GB"/>
+        </w:rPr>
+        <w:t>id_producto</w:t>
+      </w:r>
+      <w:proofErr w:type="spellEnd"/>
+      <w:r>
+        <w:rPr>
+          <w:lang w:val="en-GB"/>
+        </w:rPr>
+        <w:t xml:space="preserve">) REFERENCES </w:t>
+      </w:r>
+      <w:proofErr w:type="spellStart"/>
+      <w:r>
+        <w:rPr>
+          <w:lang w:val="en-GB"/>
+        </w:rPr>
+        <w:t>productos</w:t>
+      </w:r>
+      <w:proofErr w:type="spellEnd"/>
+      <w:r>
+        <w:rPr>
+          <w:lang w:val="en-GB"/>
+        </w:rPr>
+        <w:t>(</w:t>
+      </w:r>
+      <w:proofErr w:type="spellStart"/>
+      <w:r>
+        <w:rPr>
+          <w:lang w:val="en-GB"/>
+        </w:rPr>
+        <w:t>id_producto</w:t>
+      </w:r>
+      <w:proofErr w:type="spellEnd"/>
+      <w:r>
+        <w:rPr>
+          <w:lang w:val="en-GB"/>
+        </w:rPr>
+        <w:t>)</w:t>
+      </w:r>
+    </w:p>
+    <w:p>
+      <w:pPr>
+        <w:rPr>
+          <w:lang w:val="en-GB"/>
+        </w:rPr>
+      </w:pPr>
+    </w:p>
+    <w:p>
+      <w:pPr>
+        <w:rPr>
+          <w:lang w:val="en-GB"/>
+        </w:rPr>
+      </w:pPr>
     </w:p>
     <w:p>
       <w:pPr>
@@ -851,8 +1202,21 @@
         <w:t>INSERT INTO clientes (</w:t>
       </w:r>
       <w:proofErr w:type="spellStart"/>
-      <w:r>
-        <w:t>nombre,email,telefono,ciudad,fecha_alta</w:t>
+      <w:proofErr w:type="gramStart"/>
+      <w:r>
+        <w:t>nombre,email</w:t>
+      </w:r>
+      <w:proofErr w:type="gramEnd"/>
+      <w:r>
+        <w:t>,</w:t>
+      </w:r>
+      <w:proofErr w:type="gramStart"/>
+      <w:r>
+        <w:t>telefono,ciudad</w:t>
+      </w:r>
+      <w:proofErr w:type="gramEnd"/>
+      <w:r>
+        <w:t>,fecha_alta</w:t>
       </w:r>
       <w:proofErr w:type="spellEnd"/>
       <w:r>
@@ -861,27 +1225,67 @@
     </w:p>
     <w:p>
       <w:r>
-        <w:t>('Ana Ruiz','ana@correo.com','600111222','Málaga','2025-01-10'),</w:t>
-      </w:r>
-    </w:p>
-    <w:p>
-      <w:r>
-        <w:t>('Luis Pérez','luis@correo.com','600222333','Sevilla','2025-02-05'),</w:t>
-      </w:r>
-    </w:p>
-    <w:p>
-      <w:r>
-        <w:t>('María Díaz','maria@correo.com','600333444','Málaga','2025-03-12'),</w:t>
-      </w:r>
-    </w:p>
-    <w:p>
-      <w:r>
-        <w:t>('Javier Soto',NULL,'600444555','Granada','2025-03-20'),</w:t>
-      </w:r>
-    </w:p>
-    <w:p>
-      <w:r>
-        <w:t>('Carmen León','carmen@correo.com','600555666','Cádiz','2025-04-02');</w:t>
+        <w:t>('Ana Ruiz</w:t>
+      </w:r>
+      <w:proofErr w:type="gramStart"/>
+      <w:r>
+        <w:t>','ana@correo.com</w:t>
+      </w:r>
+      <w:proofErr w:type="gramEnd"/>
+      <w:r>
+        <w:t>','600111222','Málaga','2025-01-10'),</w:t>
+      </w:r>
+    </w:p>
+    <w:p>
+      <w:r>
+        <w:t>('Luis Pérez</w:t>
+      </w:r>
+      <w:proofErr w:type="gramStart"/>
+      <w:r>
+        <w:t>','luis@correo.com</w:t>
+      </w:r>
+      <w:proofErr w:type="gramEnd"/>
+      <w:r>
+        <w:t>','600222333','Sevilla','2025-02-05'),</w:t>
+      </w:r>
+    </w:p>
+    <w:p>
+      <w:r>
+        <w:t>('María Díaz</w:t>
+      </w:r>
+      <w:proofErr w:type="gramStart"/>
+      <w:r>
+        <w:t>','maria@correo.com</w:t>
+      </w:r>
+      <w:proofErr w:type="gramEnd"/>
+      <w:r>
+        <w:t>','600333444','Málaga','2025-03-12'),</w:t>
+      </w:r>
+    </w:p>
+    <w:p>
+      <w:r>
+        <w:t>('Javier Soto</w:t>
+      </w:r>
+      <w:proofErr w:type="gramStart"/>
+      <w:r>
+        <w:t>',NULL</w:t>
+      </w:r>
+      <w:proofErr w:type="gramEnd"/>
+      <w:r>
+        <w:t>,'600444555','Granada','2025-03-20'),</w:t>
+      </w:r>
+    </w:p>
+    <w:p>
+      <w:r>
+        <w:t>('Carmen León</w:t>
+      </w:r>
+      <w:proofErr w:type="gramStart"/>
+      <w:r>
+        <w:t>','carmen@correo.com</w:t>
+      </w:r>
+      <w:proofErr w:type="gramEnd"/>
+      <w:r>
+        <w:t>','600555666','Cádiz','2025-04-02');</w:t>
       </w:r>
     </w:p>
     <w:p/>
@@ -905,6 +1309,7 @@
     </w:p>
     <w:p>
       <w:r>
+        <w:lastRenderedPageBreak/>
         <w:t>('Portátiles'),</w:t>
       </w:r>
     </w:p>
@@ -924,8 +1329,21 @@
         <w:t>INSERT INTO productos (</w:t>
       </w:r>
       <w:proofErr w:type="spellStart"/>
-      <w:r>
-        <w:t>nombre,precio,stock,id_categoria</w:t>
+      <w:proofErr w:type="gramStart"/>
+      <w:r>
+        <w:t>nombre,precio</w:t>
+      </w:r>
+      <w:proofErr w:type="gramEnd"/>
+      <w:r>
+        <w:t>,</w:t>
+      </w:r>
+      <w:proofErr w:type="gramStart"/>
+      <w:r>
+        <w:t>stock,id</w:t>
+      </w:r>
+      <w:proofErr w:type="gramEnd"/>
+      <w:r>
+        <w:t>_categoria</w:t>
       </w:r>
       <w:proofErr w:type="spellEnd"/>
       <w:r>
@@ -944,160 +1362,173 @@
     </w:p>
     <w:p>
       <w:r>
+        <w:t>('Xiaomi Redmi Note 12',199.00,20,1),</w:t>
+      </w:r>
+    </w:p>
+    <w:p>
+      <w:r>
+        <w:t>('Portátil Lenovo i5',749.00,8,2),</w:t>
+      </w:r>
+    </w:p>
+    <w:p>
+      <w:pPr>
+        <w:rPr>
+          <w:lang w:val="en-GB"/>
+        </w:rPr>
+      </w:pPr>
+      <w:r>
+        <w:rPr>
+          <w:lang w:val="en-GB"/>
+        </w:rPr>
+        <w:t>('MacBook Air M1',899.00,5,2),</w:t>
+      </w:r>
+    </w:p>
+    <w:p>
+      <w:pPr>
+        <w:rPr>
+          <w:lang w:val="en-GB"/>
+        </w:rPr>
+      </w:pPr>
+      <w:r>
+        <w:rPr>
+          <w:lang w:val="en-GB"/>
+        </w:rPr>
+        <w:t>('Auriculares Bluetooth',49.90,50,3),</w:t>
+      </w:r>
+    </w:p>
+    <w:p>
+      <w:r>
+        <w:t>('Cargador USB-C 65W',29.90,40,3),</w:t>
+      </w:r>
+    </w:p>
+    <w:p>
+      <w:r>
+        <w:t>('SSD 1TB',89.90,30,4),</w:t>
+      </w:r>
+    </w:p>
+    <w:p>
+      <w:r>
+        <w:t>('RAM 16GB DDR4',59.90,25,4);</w:t>
+      </w:r>
+    </w:p>
+    <w:p/>
+    <w:p>
+      <w:r>
+        <w:t>INSERT INTO ventas (</w:t>
+      </w:r>
+      <w:proofErr w:type="spellStart"/>
+      <w:proofErr w:type="gramStart"/>
+      <w:r>
+        <w:t>fecha,id</w:t>
+      </w:r>
+      <w:proofErr w:type="gramEnd"/>
+      <w:r>
+        <w:t>_</w:t>
+      </w:r>
+      <w:proofErr w:type="gramStart"/>
+      <w:r>
+        <w:t>cliente,metodo</w:t>
+      </w:r>
+      <w:proofErr w:type="gramEnd"/>
+      <w:r>
+        <w:t>_pago</w:t>
+      </w:r>
+      <w:proofErr w:type="spellEnd"/>
+      <w:r>
+        <w:t>) VALUES</w:t>
+      </w:r>
+    </w:p>
+    <w:p>
+      <w:r>
+        <w:t>('2025-04-10',1,'TARJETA'),</w:t>
+      </w:r>
+    </w:p>
+    <w:p>
+      <w:r>
+        <w:t>('2025-04-10',2,'BIZUM'),</w:t>
+      </w:r>
+    </w:p>
+    <w:p>
+      <w:r>
+        <w:t>('2025-04-12',1,'EFECTIVO'),</w:t>
+      </w:r>
+    </w:p>
+    <w:p>
+      <w:r>
+        <w:t>('2025-04-15',3,'TARJETA'),</w:t>
+      </w:r>
+    </w:p>
+    <w:p>
+      <w:r>
+        <w:t>('2025-04-18',5,'TARJETA');</w:t>
+      </w:r>
+    </w:p>
+    <w:p/>
+    <w:p>
+      <w:r>
+        <w:t>-- detalle: (</w:t>
+      </w:r>
+      <w:proofErr w:type="spellStart"/>
+      <w:r>
+        <w:t>id_venta</w:t>
+      </w:r>
+      <w:proofErr w:type="spellEnd"/>
+      <w:r>
+        <w:t xml:space="preserve">, </w:t>
+      </w:r>
+      <w:proofErr w:type="spellStart"/>
+      <w:r>
+        <w:t>id_producto</w:t>
+      </w:r>
+      <w:proofErr w:type="spellEnd"/>
+      <w:r>
+        <w:t xml:space="preserve">, cantidad, </w:t>
+      </w:r>
+      <w:proofErr w:type="spellStart"/>
+      <w:r>
+        <w:t>precio_unitario</w:t>
+      </w:r>
+      <w:proofErr w:type="spellEnd"/>
+      <w:r>
+        <w:t>)</w:t>
+      </w:r>
+    </w:p>
+    <w:p>
+      <w:r>
+        <w:t xml:space="preserve">INSERT INTO </w:t>
+      </w:r>
+      <w:proofErr w:type="spellStart"/>
+      <w:r>
+        <w:t>detalle_venta</w:t>
+      </w:r>
+      <w:proofErr w:type="spellEnd"/>
+      <w:r>
+        <w:t xml:space="preserve"> VALUES</w:t>
+      </w:r>
+    </w:p>
+    <w:p>
+      <w:r>
+        <w:t>(1,1,1,599.00),</w:t>
+      </w:r>
+    </w:p>
+    <w:p>
+      <w:r>
+        <w:t>(1,6,2,49.90),</w:t>
+      </w:r>
+    </w:p>
+    <w:p>
+      <w:r>
+        <w:t>(2,3,1,199.00),</w:t>
+      </w:r>
+    </w:p>
+    <w:p>
+      <w:r>
+        <w:t>(2,7,1,29.90),</w:t>
+      </w:r>
+    </w:p>
+    <w:p>
+      <w:r>
         <w:lastRenderedPageBreak/>
-        <w:t>('Xiaomi Redmi Note 12',199.00,20,1),</w:t>
-      </w:r>
-    </w:p>
-    <w:p>
-      <w:r>
-        <w:t>('Portátil Lenovo i5',749.00,8,2),</w:t>
-      </w:r>
-    </w:p>
-    <w:p>
-      <w:pPr>
-        <w:rPr>
-          <w:lang w:val="en-GB"/>
-        </w:rPr>
-      </w:pPr>
-      <w:r>
-        <w:rPr>
-          <w:lang w:val="en-GB"/>
-        </w:rPr>
-        <w:t>('MacBook Air M1',899.00,5,2),</w:t>
-      </w:r>
-    </w:p>
-    <w:p>
-      <w:pPr>
-        <w:rPr>
-          <w:lang w:val="en-GB"/>
-        </w:rPr>
-      </w:pPr>
-      <w:r>
-        <w:rPr>
-          <w:lang w:val="en-GB"/>
-        </w:rPr>
-        <w:t>('Auriculares Bluetooth',49.90,50,3),</w:t>
-      </w:r>
-    </w:p>
-    <w:p>
-      <w:r>
-        <w:t>('Cargador USB-C 65W',29.90,40,3),</w:t>
-      </w:r>
-    </w:p>
-    <w:p>
-      <w:r>
-        <w:t>('SSD 1TB',89.90,30,4),</w:t>
-      </w:r>
-    </w:p>
-    <w:p>
-      <w:r>
-        <w:t>('RAM 16GB DDR4',59.90,25,4);</w:t>
-      </w:r>
-    </w:p>
-    <w:p/>
-    <w:p>
-      <w:r>
-        <w:t>INSERT INTO ventas (</w:t>
-      </w:r>
-      <w:proofErr w:type="spellStart"/>
-      <w:r>
-        <w:t>fecha,id_cliente,metodo_pago</w:t>
-      </w:r>
-      <w:proofErr w:type="spellEnd"/>
-      <w:r>
-        <w:t>) VALUES</w:t>
-      </w:r>
-    </w:p>
-    <w:p>
-      <w:r>
-        <w:t>('2025-04-10',1,'TARJETA'),</w:t>
-      </w:r>
-    </w:p>
-    <w:p>
-      <w:r>
-        <w:t>('2025-04-10',2,'BIZUM'),</w:t>
-      </w:r>
-    </w:p>
-    <w:p>
-      <w:r>
-        <w:t>('2025-04-12',1,'EFECTIVO'),</w:t>
-      </w:r>
-    </w:p>
-    <w:p>
-      <w:r>
-        <w:t>('2025-04-15',3,'TARJETA'),</w:t>
-      </w:r>
-    </w:p>
-    <w:p>
-      <w:r>
-        <w:t>('2025-04-18',5,'TARJETA');</w:t>
-      </w:r>
-    </w:p>
-    <w:p/>
-    <w:p>
-      <w:r>
-        <w:t>-- detalle: (</w:t>
-      </w:r>
-      <w:proofErr w:type="spellStart"/>
-      <w:r>
-        <w:t>id_venta</w:t>
-      </w:r>
-      <w:proofErr w:type="spellEnd"/>
-      <w:r>
-        <w:t xml:space="preserve">, </w:t>
-      </w:r>
-      <w:proofErr w:type="spellStart"/>
-      <w:r>
-        <w:t>id_producto</w:t>
-      </w:r>
-      <w:proofErr w:type="spellEnd"/>
-      <w:r>
-        <w:t xml:space="preserve">, cantidad, </w:t>
-      </w:r>
-      <w:proofErr w:type="spellStart"/>
-      <w:r>
-        <w:t>precio_unitario</w:t>
-      </w:r>
-      <w:proofErr w:type="spellEnd"/>
-      <w:r>
-        <w:t>)</w:t>
-      </w:r>
-    </w:p>
-    <w:p>
-      <w:r>
-        <w:t xml:space="preserve">INSERT INTO </w:t>
-      </w:r>
-      <w:proofErr w:type="spellStart"/>
-      <w:r>
-        <w:t>detalle_venta</w:t>
-      </w:r>
-      <w:proofErr w:type="spellEnd"/>
-      <w:r>
-        <w:t xml:space="preserve"> VALUES</w:t>
-      </w:r>
-    </w:p>
-    <w:p>
-      <w:r>
-        <w:t>(1,1,1,599.00),</w:t>
-      </w:r>
-    </w:p>
-    <w:p>
-      <w:r>
-        <w:t>(1,6,2,49.90),</w:t>
-      </w:r>
-    </w:p>
-    <w:p>
-      <w:r>
-        <w:t>(2,3,1,199.00),</w:t>
-      </w:r>
-    </w:p>
-    <w:p>
-      <w:r>
-        <w:t>(2,7,1,29.90),</w:t>
-      </w:r>
-    </w:p>
-    <w:p>
-      <w:r>
         <w:t>(3,2,1,329.00),</w:t>
       </w:r>
     </w:p>
@@ -1380,6 +1811,7 @@
     </w:p>
     <w:p>
       <w:r>
+        <w:lastRenderedPageBreak/>
         <w:t>SELECT * FROM clientes;</w:t>
       </w:r>
     </w:p>
@@ -1418,8 +1850,16 @@
         <w:rPr>
           <w:lang w:val="en-GB"/>
         </w:rPr>
-        <w:t>SELECT * FROM productos WHERE precio &gt; 300 ORDER BY precio DESC;</w:t>
-      </w:r>
+        <w:t xml:space="preserve">SELECT * FROM productos WHERE precio &gt; 300 ORDER BY precio </w:t>
+      </w:r>
+      <w:proofErr w:type="gramStart"/>
+      <w:r>
+        <w:rPr>
+          <w:lang w:val="en-GB"/>
+        </w:rPr>
+        <w:t>DESC;</w:t>
+      </w:r>
+      <w:proofErr w:type="gramEnd"/>
     </w:p>
     <w:p>
       <w:pPr>
@@ -1451,8 +1891,16 @@
         <w:rPr>
           <w:lang w:val="en-GB"/>
         </w:rPr>
-        <w:t>SELECT * FROM productos ORDER BY precio ASC LIMIT 3;</w:t>
-      </w:r>
+        <w:t xml:space="preserve">SELECT * FROM productos ORDER BY precio ASC LIMIT </w:t>
+      </w:r>
+      <w:proofErr w:type="gramStart"/>
+      <w:r>
+        <w:rPr>
+          <w:lang w:val="en-GB"/>
+        </w:rPr>
+        <w:t>3;</w:t>
+      </w:r>
+      <w:proofErr w:type="gramEnd"/>
     </w:p>
     <w:p>
       <w:pPr>
@@ -1484,7 +1932,35 @@
         <w:rPr>
           <w:lang w:val="en-GB"/>
         </w:rPr>
-        <w:t>SELECT c.nombre, COUNT(*) AS num_productos</w:t>
+        <w:t xml:space="preserve">SELECT </w:t>
+      </w:r>
+      <w:proofErr w:type="gramStart"/>
+      <w:r>
+        <w:rPr>
+          <w:lang w:val="en-GB"/>
+        </w:rPr>
+        <w:t>c.nombre</w:t>
+      </w:r>
+      <w:proofErr w:type="gramEnd"/>
+      <w:r>
+        <w:rPr>
+          <w:lang w:val="en-GB"/>
+        </w:rPr>
+        <w:t xml:space="preserve">, </w:t>
+      </w:r>
+      <w:proofErr w:type="gramStart"/>
+      <w:r>
+        <w:rPr>
+          <w:lang w:val="en-GB"/>
+        </w:rPr>
+        <w:t>COUNT(</w:t>
+      </w:r>
+      <w:proofErr w:type="gramEnd"/>
+      <w:r>
+        <w:rPr>
+          <w:lang w:val="en-GB"/>
+        </w:rPr>
+        <w:t>*) AS num_productos</w:t>
       </w:r>
     </w:p>
     <w:p>
@@ -1523,7 +1999,21 @@
         <w:rPr>
           <w:lang w:val="en-GB"/>
         </w:rPr>
-        <w:t>GROUP BY c.nombre;</w:t>
+        <w:t xml:space="preserve">GROUP BY </w:t>
+      </w:r>
+      <w:proofErr w:type="gramStart"/>
+      <w:r>
+        <w:rPr>
+          <w:lang w:val="en-GB"/>
+        </w:rPr>
+        <w:t>c.nombre</w:t>
+      </w:r>
+      <w:proofErr w:type="gramEnd"/>
+      <w:r>
+        <w:rPr>
+          <w:lang w:val="en-GB"/>
+        </w:rPr>
+        <w:t>;</w:t>
       </w:r>
     </w:p>
     <w:p>
@@ -1556,8 +2046,30 @@
         <w:rPr>
           <w:lang w:val="en-GB"/>
         </w:rPr>
-        <w:t>SELECT SUM(stock) AS stock_total FROM productos;</w:t>
-      </w:r>
+        <w:t xml:space="preserve">SELECT </w:t>
+      </w:r>
+      <w:proofErr w:type="gramStart"/>
+      <w:r>
+        <w:rPr>
+          <w:lang w:val="en-GB"/>
+        </w:rPr>
+        <w:t>SUM(</w:t>
+      </w:r>
+      <w:proofErr w:type="gramEnd"/>
+      <w:r>
+        <w:rPr>
+          <w:lang w:val="en-GB"/>
+        </w:rPr>
+        <w:t xml:space="preserve">stock) AS stock_total FROM </w:t>
+      </w:r>
+      <w:proofErr w:type="gramStart"/>
+      <w:r>
+        <w:rPr>
+          <w:lang w:val="en-GB"/>
+        </w:rPr>
+        <w:t>productos;</w:t>
+      </w:r>
+      <w:proofErr w:type="gramEnd"/>
     </w:p>
     <w:p>
       <w:pPr>
@@ -1589,8 +2101,16 @@
         <w:rPr>
           <w:lang w:val="en-GB"/>
         </w:rPr>
-        <w:t>SELECT * FROM productos WHERE nombre LIKE '%USB%';</w:t>
-      </w:r>
+        <w:t>SELECT * FROM productos WHERE nombre LIKE '%USB%</w:t>
+      </w:r>
+      <w:proofErr w:type="gramStart"/>
+      <w:r>
+        <w:rPr>
+          <w:lang w:val="en-GB"/>
+        </w:rPr>
+        <w:t>';</w:t>
+      </w:r>
+      <w:proofErr w:type="gramEnd"/>
     </w:p>
     <w:p>
       <w:pPr>
@@ -1622,8 +2142,16 @@
         <w:rPr>
           <w:lang w:val="en-GB"/>
         </w:rPr>
-        <w:t>SELECT * FROM clientes WHERE email IS NULL;</w:t>
-      </w:r>
+        <w:t xml:space="preserve">SELECT * FROM clientes WHERE email IS </w:t>
+      </w:r>
+      <w:proofErr w:type="gramStart"/>
+      <w:r>
+        <w:rPr>
+          <w:lang w:val="en-GB"/>
+        </w:rPr>
+        <w:t>NULL;</w:t>
+      </w:r>
+      <w:proofErr w:type="gramEnd"/>
     </w:p>
     <w:p>
       <w:r>
@@ -1682,6 +2210,7 @@
         </w:numPr>
       </w:pPr>
       <w:r>
+        <w:lastRenderedPageBreak/>
         <w:t xml:space="preserve">Saca el detalle de una venta: </w:t>
       </w:r>
       <w:proofErr w:type="spellStart"/>
@@ -1788,7 +2317,6 @@
           <w:b/>
           <w:bCs/>
         </w:rPr>
-        <w:lastRenderedPageBreak/>
         <w:t>✅</w:t>
       </w:r>
       <w:r>
@@ -1817,24 +2345,33 @@
         <w:t xml:space="preserve">, </w:t>
       </w:r>
       <w:proofErr w:type="spellStart"/>
+      <w:proofErr w:type="gramStart"/>
       <w:r>
         <w:t>v.fecha</w:t>
       </w:r>
       <w:proofErr w:type="spellEnd"/>
+      <w:proofErr w:type="gramEnd"/>
       <w:r>
         <w:t xml:space="preserve">, </w:t>
       </w:r>
       <w:proofErr w:type="spellStart"/>
+      <w:proofErr w:type="gramStart"/>
       <w:r>
         <w:t>c.nombre</w:t>
       </w:r>
       <w:proofErr w:type="spellEnd"/>
+      <w:proofErr w:type="gramEnd"/>
       <w:r>
         <w:t xml:space="preserve"> AS cliente, </w:t>
       </w:r>
       <w:proofErr w:type="spellStart"/>
-      <w:r>
-        <w:t>v.metodo_pago</w:t>
+      <w:proofErr w:type="gramStart"/>
+      <w:r>
+        <w:t>v.metodo</w:t>
+      </w:r>
+      <w:proofErr w:type="gramEnd"/>
+      <w:r>
+        <w:t>_pago</w:t>
       </w:r>
       <w:proofErr w:type="spellEnd"/>
     </w:p>
@@ -1861,8 +2398,16 @@
         <w:rPr>
           <w:lang w:val="en-GB"/>
         </w:rPr>
-        <w:t>JOIN clientes c ON v.id_cliente = c.id_cliente;</w:t>
-      </w:r>
+        <w:t>JOIN clientes c ON v.id_cliente = c.id_</w:t>
+      </w:r>
+      <w:proofErr w:type="gramStart"/>
+      <w:r>
+        <w:rPr>
+          <w:lang w:val="en-GB"/>
+        </w:rPr>
+        <w:t>cliente;</w:t>
+      </w:r>
+      <w:proofErr w:type="gramEnd"/>
     </w:p>
     <w:p>
       <w:pPr>
@@ -1889,24 +2434,33 @@
         <w:t xml:space="preserve">, </w:t>
       </w:r>
       <w:proofErr w:type="spellStart"/>
+      <w:proofErr w:type="gramStart"/>
       <w:r>
         <w:t>p.nombre</w:t>
       </w:r>
       <w:proofErr w:type="spellEnd"/>
+      <w:proofErr w:type="gramEnd"/>
       <w:r>
         <w:t xml:space="preserve"> AS producto, </w:t>
       </w:r>
       <w:proofErr w:type="spellStart"/>
+      <w:proofErr w:type="gramStart"/>
       <w:r>
         <w:t>dv.cantidad</w:t>
       </w:r>
       <w:proofErr w:type="spellEnd"/>
+      <w:proofErr w:type="gramEnd"/>
       <w:r>
         <w:t xml:space="preserve">, </w:t>
       </w:r>
       <w:proofErr w:type="spellStart"/>
-      <w:r>
-        <w:t>dv.precio_unitario</w:t>
+      <w:proofErr w:type="gramStart"/>
+      <w:r>
+        <w:t>dv.precio</w:t>
+      </w:r>
+      <w:proofErr w:type="gramEnd"/>
+      <w:r>
+        <w:t>_unitario</w:t>
       </w:r>
       <w:proofErr w:type="spellEnd"/>
     </w:p>
@@ -1968,10 +2522,12 @@
         <w:t xml:space="preserve">, </w:t>
       </w:r>
       <w:proofErr w:type="spellStart"/>
+      <w:proofErr w:type="gramStart"/>
       <w:r>
         <w:t>p.nombre</w:t>
       </w:r>
       <w:proofErr w:type="spellEnd"/>
+      <w:proofErr w:type="gramEnd"/>
       <w:r>
         <w:t xml:space="preserve"> AS producto,</w:t>
       </w:r>
@@ -1989,8 +2545,13 @@
         <w:t xml:space="preserve">, </w:t>
       </w:r>
       <w:proofErr w:type="spellStart"/>
-      <w:r>
-        <w:t>dv.precio_unitario</w:t>
+      <w:proofErr w:type="gramStart"/>
+      <w:r>
+        <w:t>dv.precio</w:t>
+      </w:r>
+      <w:proofErr w:type="gramEnd"/>
+      <w:r>
+        <w:t>_unitario</w:t>
       </w:r>
       <w:proofErr w:type="spellEnd"/>
       <w:r>
@@ -2010,8 +2571,13 @@
         <w:t xml:space="preserve"> * </w:t>
       </w:r>
       <w:proofErr w:type="spellStart"/>
-      <w:r>
-        <w:t>dv.precio_unitario</w:t>
+      <w:proofErr w:type="gramStart"/>
+      <w:r>
+        <w:t>dv.precio</w:t>
+      </w:r>
+      <w:proofErr w:type="gramEnd"/>
+      <w:r>
+        <w:t>_unitario</w:t>
       </w:r>
       <w:proofErr w:type="spellEnd"/>
       <w:r>
@@ -2083,19 +2649,29 @@
     </w:p>
     <w:p>
       <w:r>
-        <w:t xml:space="preserve">       SUM(</w:t>
+        <w:t xml:space="preserve">       </w:t>
+      </w:r>
+      <w:proofErr w:type="gramStart"/>
+      <w:r>
+        <w:t>SUM(</w:t>
       </w:r>
       <w:proofErr w:type="spellStart"/>
       <w:r>
         <w:t>dv.cantidad</w:t>
       </w:r>
       <w:proofErr w:type="spellEnd"/>
+      <w:proofErr w:type="gramEnd"/>
       <w:r>
         <w:t xml:space="preserve"> * </w:t>
       </w:r>
       <w:proofErr w:type="spellStart"/>
-      <w:r>
-        <w:t>dv.precio_unitario</w:t>
+      <w:proofErr w:type="gramStart"/>
+      <w:r>
+        <w:t>dv.precio</w:t>
+      </w:r>
+      <w:proofErr w:type="gramEnd"/>
+      <w:r>
+        <w:t>_unitario</w:t>
       </w:r>
       <w:proofErr w:type="spellEnd"/>
       <w:r>
@@ -2117,6 +2693,7 @@
         <w:rPr>
           <w:lang w:val="en-GB"/>
         </w:rPr>
+        <w:lastRenderedPageBreak/>
         <w:t>FROM detalle_venta dv</w:t>
       </w:r>
     </w:p>
@@ -2130,8 +2707,16 @@
         <w:rPr>
           <w:lang w:val="en-GB"/>
         </w:rPr>
-        <w:t>GROUP BY dv.id_venta;</w:t>
-      </w:r>
+        <w:t>GROUP BY dv.id_</w:t>
+      </w:r>
+      <w:proofErr w:type="gramStart"/>
+      <w:r>
+        <w:rPr>
+          <w:lang w:val="en-GB"/>
+        </w:rPr>
+        <w:t>venta;</w:t>
+      </w:r>
+      <w:proofErr w:type="gramEnd"/>
     </w:p>
     <w:p>
       <w:pPr>
@@ -2158,29 +2743,41 @@
         <w:t xml:space="preserve">, </w:t>
       </w:r>
       <w:proofErr w:type="spellStart"/>
+      <w:proofErr w:type="gramStart"/>
       <w:r>
         <w:t>c.nombre</w:t>
       </w:r>
       <w:proofErr w:type="spellEnd"/>
+      <w:proofErr w:type="gramEnd"/>
       <w:r>
         <w:t>,</w:t>
       </w:r>
     </w:p>
     <w:p>
       <w:r>
-        <w:t xml:space="preserve">       SUM(</w:t>
+        <w:t xml:space="preserve">       </w:t>
+      </w:r>
+      <w:proofErr w:type="gramStart"/>
+      <w:r>
+        <w:t>SUM(</w:t>
       </w:r>
       <w:proofErr w:type="spellStart"/>
       <w:r>
         <w:t>dv.cantidad</w:t>
       </w:r>
       <w:proofErr w:type="spellEnd"/>
+      <w:proofErr w:type="gramEnd"/>
       <w:r>
         <w:t xml:space="preserve"> * </w:t>
       </w:r>
       <w:proofErr w:type="spellStart"/>
-      <w:r>
-        <w:t>dv.precio_unitario</w:t>
+      <w:proofErr w:type="gramStart"/>
+      <w:r>
+        <w:t>dv.precio</w:t>
+      </w:r>
+      <w:proofErr w:type="gramEnd"/>
+      <w:r>
+        <w:t>_unitario</w:t>
       </w:r>
       <w:proofErr w:type="spellEnd"/>
       <w:r>
@@ -2215,8 +2812,452 @@
         <w:rPr>
           <w:lang w:val="en-GB"/>
         </w:rPr>
+        <w:t>JOIN ventas v ON c.id_cliente = v.id_cliente</w:t>
+      </w:r>
+    </w:p>
+    <w:p>
+      <w:r>
+        <w:t xml:space="preserve">JOIN </w:t>
+      </w:r>
+      <w:proofErr w:type="spellStart"/>
+      <w:r>
+        <w:t>detalle_venta</w:t>
+      </w:r>
+      <w:proofErr w:type="spellEnd"/>
+      <w:r>
+        <w:t xml:space="preserve"> </w:t>
+      </w:r>
+      <w:proofErr w:type="spellStart"/>
+      <w:r>
+        <w:t>dv</w:t>
+      </w:r>
+      <w:proofErr w:type="spellEnd"/>
+      <w:r>
+        <w:t xml:space="preserve"> ON </w:t>
+      </w:r>
+      <w:proofErr w:type="spellStart"/>
+      <w:r>
+        <w:t>v.id_venta</w:t>
+      </w:r>
+      <w:proofErr w:type="spellEnd"/>
+      <w:r>
+        <w:t xml:space="preserve"> = </w:t>
+      </w:r>
+      <w:proofErr w:type="spellStart"/>
+      <w:r>
+        <w:t>dv.id_venta</w:t>
+      </w:r>
+      <w:proofErr w:type="spellEnd"/>
+    </w:p>
+    <w:p>
+      <w:pPr>
+        <w:rPr>
+          <w:lang w:val="en-GB"/>
+        </w:rPr>
+      </w:pPr>
+      <w:r>
+        <w:rPr>
+          <w:lang w:val="en-GB"/>
+        </w:rPr>
+        <w:t xml:space="preserve">GROUP BY c.id_cliente, </w:t>
+      </w:r>
+      <w:proofErr w:type="gramStart"/>
+      <w:r>
+        <w:rPr>
+          <w:lang w:val="en-GB"/>
+        </w:rPr>
+        <w:t>c.nombre</w:t>
+      </w:r>
+      <w:proofErr w:type="gramEnd"/>
+      <w:r>
+        <w:rPr>
+          <w:lang w:val="en-GB"/>
+        </w:rPr>
+        <w:t>;</w:t>
+      </w:r>
+    </w:p>
+    <w:p>
+      <w:pPr>
+        <w:rPr>
+          <w:lang w:val="en-GB"/>
+        </w:rPr>
+      </w:pPr>
+    </w:p>
+    <w:p>
+      <w:r>
+        <w:t>-- 14</w:t>
+      </w:r>
+    </w:p>
+    <w:p>
+      <w:r>
+        <w:t xml:space="preserve">SELECT </w:t>
+      </w:r>
+      <w:proofErr w:type="spellStart"/>
+      <w:r>
+        <w:t>c.id_cliente</w:t>
+      </w:r>
+      <w:proofErr w:type="spellEnd"/>
+      <w:r>
+        <w:t xml:space="preserve">, </w:t>
+      </w:r>
+      <w:proofErr w:type="spellStart"/>
+      <w:proofErr w:type="gramStart"/>
+      <w:r>
+        <w:t>c.nombre</w:t>
+      </w:r>
+      <w:proofErr w:type="spellEnd"/>
+      <w:proofErr w:type="gramEnd"/>
+      <w:r>
+        <w:t>,</w:t>
+      </w:r>
+    </w:p>
+    <w:p>
+      <w:r>
+        <w:t xml:space="preserve">       </w:t>
+      </w:r>
+      <w:proofErr w:type="gramStart"/>
+      <w:r>
+        <w:t>SUM(</w:t>
+      </w:r>
+      <w:proofErr w:type="spellStart"/>
+      <w:r>
+        <w:t>dv.cantidad</w:t>
+      </w:r>
+      <w:proofErr w:type="spellEnd"/>
+      <w:proofErr w:type="gramEnd"/>
+      <w:r>
+        <w:t xml:space="preserve"> * </w:t>
+      </w:r>
+      <w:proofErr w:type="spellStart"/>
+      <w:proofErr w:type="gramStart"/>
+      <w:r>
+        <w:t>dv.precio</w:t>
+      </w:r>
+      <w:proofErr w:type="gramEnd"/>
+      <w:r>
+        <w:t>_unitario</w:t>
+      </w:r>
+      <w:proofErr w:type="spellEnd"/>
+      <w:r>
+        <w:t xml:space="preserve">) AS </w:t>
+      </w:r>
+      <w:proofErr w:type="spellStart"/>
+      <w:r>
+        <w:t>gasto_total</w:t>
+      </w:r>
+      <w:proofErr w:type="spellEnd"/>
+    </w:p>
+    <w:p>
+      <w:pPr>
+        <w:rPr>
+          <w:lang w:val="en-GB"/>
+        </w:rPr>
+      </w:pPr>
+      <w:r>
+        <w:rPr>
+          <w:lang w:val="en-GB"/>
+        </w:rPr>
+        <w:t>FROM clientes c</w:t>
+      </w:r>
+    </w:p>
+    <w:p>
+      <w:pPr>
+        <w:rPr>
+          <w:lang w:val="en-GB"/>
+        </w:rPr>
+      </w:pPr>
+      <w:r>
+        <w:rPr>
+          <w:lang w:val="en-GB"/>
+        </w:rPr>
+        <w:t>JOIN ventas v ON c.id_cliente = v.id_cliente</w:t>
+      </w:r>
+    </w:p>
+    <w:p>
+      <w:r>
+        <w:t xml:space="preserve">JOIN </w:t>
+      </w:r>
+      <w:proofErr w:type="spellStart"/>
+      <w:r>
+        <w:t>detalle_venta</w:t>
+      </w:r>
+      <w:proofErr w:type="spellEnd"/>
+      <w:r>
+        <w:t xml:space="preserve"> </w:t>
+      </w:r>
+      <w:proofErr w:type="spellStart"/>
+      <w:r>
+        <w:t>dv</w:t>
+      </w:r>
+      <w:proofErr w:type="spellEnd"/>
+      <w:r>
+        <w:t xml:space="preserve"> ON </w:t>
+      </w:r>
+      <w:proofErr w:type="spellStart"/>
+      <w:r>
+        <w:t>v.id_venta</w:t>
+      </w:r>
+      <w:proofErr w:type="spellEnd"/>
+      <w:r>
+        <w:t xml:space="preserve"> = </w:t>
+      </w:r>
+      <w:proofErr w:type="spellStart"/>
+      <w:r>
+        <w:t>dv.id_venta</w:t>
+      </w:r>
+      <w:proofErr w:type="spellEnd"/>
+    </w:p>
+    <w:p>
+      <w:pPr>
+        <w:rPr>
+          <w:lang w:val="en-GB"/>
+        </w:rPr>
+      </w:pPr>
+      <w:r>
+        <w:rPr>
+          <w:lang w:val="en-GB"/>
+        </w:rPr>
+        <w:t xml:space="preserve">GROUP BY c.id_cliente, </w:t>
+      </w:r>
+      <w:proofErr w:type="gramStart"/>
+      <w:r>
+        <w:rPr>
+          <w:lang w:val="en-GB"/>
+        </w:rPr>
+        <w:t>c.nombre</w:t>
+      </w:r>
+      <w:proofErr w:type="gramEnd"/>
+    </w:p>
+    <w:p>
+      <w:pPr>
+        <w:rPr>
+          <w:lang w:val="en-GB"/>
+        </w:rPr>
+      </w:pPr>
+      <w:r>
+        <w:rPr>
+          <w:lang w:val="en-GB"/>
+        </w:rPr>
+        <w:t>ORDER BY gasto_total DESC</w:t>
+      </w:r>
+    </w:p>
+    <w:p>
+      <w:pPr>
+        <w:rPr>
+          <w:lang w:val="en-GB"/>
+        </w:rPr>
+      </w:pPr>
+      <w:r>
+        <w:rPr>
+          <w:lang w:val="en-GB"/>
+        </w:rPr>
+        <w:t xml:space="preserve">LIMIT </w:t>
+      </w:r>
+      <w:proofErr w:type="gramStart"/>
+      <w:r>
+        <w:rPr>
+          <w:lang w:val="en-GB"/>
+        </w:rPr>
+        <w:t>3;</w:t>
+      </w:r>
+      <w:proofErr w:type="gramEnd"/>
+    </w:p>
+    <w:p>
+      <w:pPr>
+        <w:rPr>
+          <w:lang w:val="en-GB"/>
+        </w:rPr>
+      </w:pPr>
+    </w:p>
+    <w:p>
+      <w:r>
+        <w:t>-- 15</w:t>
+      </w:r>
+    </w:p>
+    <w:p>
+      <w:r>
+        <w:t xml:space="preserve">SELECT </w:t>
+      </w:r>
+      <w:proofErr w:type="spellStart"/>
+      <w:r>
+        <w:t>p.id_producto</w:t>
+      </w:r>
+      <w:proofErr w:type="spellEnd"/>
+      <w:r>
+        <w:t xml:space="preserve">, </w:t>
+      </w:r>
+      <w:proofErr w:type="spellStart"/>
+      <w:proofErr w:type="gramStart"/>
+      <w:r>
+        <w:t>p.nombre</w:t>
+      </w:r>
+      <w:proofErr w:type="spellEnd"/>
+      <w:proofErr w:type="gramEnd"/>
+      <w:r>
+        <w:t>,</w:t>
+      </w:r>
+    </w:p>
+    <w:p>
+      <w:r>
+        <w:t xml:space="preserve">       </w:t>
+      </w:r>
+      <w:proofErr w:type="gramStart"/>
+      <w:r>
+        <w:t>SUM(</w:t>
+      </w:r>
+      <w:proofErr w:type="spellStart"/>
+      <w:r>
+        <w:t>dv.cantidad</w:t>
+      </w:r>
+      <w:proofErr w:type="spellEnd"/>
+      <w:proofErr w:type="gramEnd"/>
+      <w:r>
+        <w:t xml:space="preserve">) AS </w:t>
+      </w:r>
+      <w:proofErr w:type="spellStart"/>
+      <w:r>
+        <w:t>unidades_vendidas</w:t>
+      </w:r>
+      <w:proofErr w:type="spellEnd"/>
+    </w:p>
+    <w:p>
+      <w:r>
+        <w:t>FROM productos p</w:t>
+      </w:r>
+    </w:p>
+    <w:p>
+      <w:r>
+        <w:t xml:space="preserve">JOIN </w:t>
+      </w:r>
+      <w:proofErr w:type="spellStart"/>
+      <w:r>
+        <w:t>detalle_venta</w:t>
+      </w:r>
+      <w:proofErr w:type="spellEnd"/>
+      <w:r>
+        <w:t xml:space="preserve"> </w:t>
+      </w:r>
+      <w:proofErr w:type="spellStart"/>
+      <w:r>
+        <w:t>dv</w:t>
+      </w:r>
+      <w:proofErr w:type="spellEnd"/>
+      <w:r>
+        <w:t xml:space="preserve"> ON </w:t>
+      </w:r>
+      <w:proofErr w:type="spellStart"/>
+      <w:r>
+        <w:t>p.id_producto</w:t>
+      </w:r>
+      <w:proofErr w:type="spellEnd"/>
+      <w:r>
+        <w:t xml:space="preserve"> = </w:t>
+      </w:r>
+      <w:proofErr w:type="spellStart"/>
+      <w:r>
+        <w:t>dv.id_producto</w:t>
+      </w:r>
+      <w:proofErr w:type="spellEnd"/>
+    </w:p>
+    <w:p>
+      <w:r>
+        <w:t xml:space="preserve">GROUP BY </w:t>
+      </w:r>
+      <w:proofErr w:type="spellStart"/>
+      <w:r>
+        <w:t>p.id_producto</w:t>
+      </w:r>
+      <w:proofErr w:type="spellEnd"/>
+      <w:r>
+        <w:t xml:space="preserve">, </w:t>
+      </w:r>
+      <w:proofErr w:type="spellStart"/>
+      <w:proofErr w:type="gramStart"/>
+      <w:r>
+        <w:t>p.nombre</w:t>
+      </w:r>
+      <w:proofErr w:type="spellEnd"/>
+      <w:proofErr w:type="gramEnd"/>
+    </w:p>
+    <w:p>
+      <w:r>
+        <w:t xml:space="preserve">ORDER BY </w:t>
+      </w:r>
+      <w:proofErr w:type="spellStart"/>
+      <w:r>
+        <w:t>unidades_vendidas</w:t>
+      </w:r>
+      <w:proofErr w:type="spellEnd"/>
+      <w:r>
+        <w:t xml:space="preserve"> DESC</w:t>
+      </w:r>
+    </w:p>
+    <w:p>
+      <w:r>
         <w:lastRenderedPageBreak/>
-        <w:t>JOIN ventas v ON c.id_cliente = v.id_cliente</w:t>
+        <w:t>LIMIT 3;</w:t>
+      </w:r>
+    </w:p>
+    <w:p/>
+    <w:p>
+      <w:r>
+        <w:t>-- 16</w:t>
+      </w:r>
+    </w:p>
+    <w:p>
+      <w:r>
+        <w:t xml:space="preserve">SELECT </w:t>
+      </w:r>
+      <w:proofErr w:type="spellStart"/>
+      <w:proofErr w:type="gramStart"/>
+      <w:r>
+        <w:t>v.fecha</w:t>
+      </w:r>
+      <w:proofErr w:type="spellEnd"/>
+      <w:proofErr w:type="gramEnd"/>
+      <w:r>
+        <w:t>,</w:t>
+      </w:r>
+    </w:p>
+    <w:p>
+      <w:r>
+        <w:t xml:space="preserve">       </w:t>
+      </w:r>
+      <w:proofErr w:type="gramStart"/>
+      <w:r>
+        <w:t>SUM(</w:t>
+      </w:r>
+      <w:proofErr w:type="spellStart"/>
+      <w:r>
+        <w:t>dv.cantidad</w:t>
+      </w:r>
+      <w:proofErr w:type="spellEnd"/>
+      <w:proofErr w:type="gramEnd"/>
+      <w:r>
+        <w:t xml:space="preserve"> * </w:t>
+      </w:r>
+      <w:proofErr w:type="spellStart"/>
+      <w:proofErr w:type="gramStart"/>
+      <w:r>
+        <w:t>dv.precio</w:t>
+      </w:r>
+      <w:proofErr w:type="gramEnd"/>
+      <w:r>
+        <w:t>_unitario</w:t>
+      </w:r>
+      <w:proofErr w:type="spellEnd"/>
+      <w:r>
+        <w:t xml:space="preserve">) AS </w:t>
+      </w:r>
+      <w:proofErr w:type="spellStart"/>
+      <w:r>
+        <w:t>facturacion_dia</w:t>
+      </w:r>
+      <w:proofErr w:type="spellEnd"/>
+    </w:p>
+    <w:p>
+      <w:r>
+        <w:t>FROM ventas v</w:t>
       </w:r>
     </w:p>
     <w:p>
@@ -2263,565 +3304,201 @@
         <w:rPr>
           <w:lang w:val="en-GB"/>
         </w:rPr>
-        <w:t>GROUP BY c.id_cliente, c.nombre;</w:t>
-      </w:r>
-    </w:p>
-    <w:p>
-      <w:pPr>
-        <w:rPr>
-          <w:lang w:val="en-GB"/>
-        </w:rPr>
-      </w:pPr>
-    </w:p>
-    <w:p>
-      <w:r>
-        <w:t>-- 14</w:t>
-      </w:r>
-    </w:p>
-    <w:p>
-      <w:r>
-        <w:t xml:space="preserve">SELECT </w:t>
-      </w:r>
-      <w:proofErr w:type="spellStart"/>
-      <w:r>
-        <w:t>c.id_cliente</w:t>
-      </w:r>
-      <w:proofErr w:type="spellEnd"/>
-      <w:r>
-        <w:t xml:space="preserve">, </w:t>
-      </w:r>
-      <w:proofErr w:type="spellStart"/>
-      <w:r>
-        <w:t>c.nombre</w:t>
-      </w:r>
-      <w:proofErr w:type="spellEnd"/>
-      <w:r>
-        <w:t>,</w:t>
-      </w:r>
-    </w:p>
-    <w:p>
-      <w:r>
-        <w:t xml:space="preserve">       SUM(</w:t>
-      </w:r>
-      <w:proofErr w:type="spellStart"/>
-      <w:r>
-        <w:t>dv.cantidad</w:t>
-      </w:r>
-      <w:proofErr w:type="spellEnd"/>
-      <w:r>
-        <w:t xml:space="preserve"> * </w:t>
-      </w:r>
-      <w:proofErr w:type="spellStart"/>
-      <w:r>
-        <w:t>dv.precio_unitario</w:t>
-      </w:r>
-      <w:proofErr w:type="spellEnd"/>
-      <w:r>
-        <w:t xml:space="preserve">) AS </w:t>
-      </w:r>
-      <w:proofErr w:type="spellStart"/>
-      <w:r>
-        <w:t>gasto_total</w:t>
-      </w:r>
-      <w:proofErr w:type="spellEnd"/>
-    </w:p>
-    <w:p>
-      <w:pPr>
-        <w:rPr>
-          <w:lang w:val="en-GB"/>
-        </w:rPr>
-      </w:pPr>
-      <w:r>
-        <w:rPr>
-          <w:lang w:val="en-GB"/>
-        </w:rPr>
-        <w:t>FROM clientes c</w:t>
-      </w:r>
-    </w:p>
-    <w:p>
-      <w:pPr>
-        <w:rPr>
-          <w:lang w:val="en-GB"/>
-        </w:rPr>
-      </w:pPr>
-      <w:r>
-        <w:rPr>
-          <w:lang w:val="en-GB"/>
-        </w:rPr>
-        <w:t>JOIN ventas v ON c.id_cliente = v.id_cliente</w:t>
-      </w:r>
-    </w:p>
-    <w:p>
-      <w:r>
-        <w:t xml:space="preserve">JOIN </w:t>
-      </w:r>
-      <w:proofErr w:type="spellStart"/>
-      <w:r>
-        <w:t>detalle_venta</w:t>
-      </w:r>
-      <w:proofErr w:type="spellEnd"/>
-      <w:r>
+        <w:t xml:space="preserve">GROUP BY </w:t>
+      </w:r>
+      <w:proofErr w:type="gramStart"/>
+      <w:r>
+        <w:rPr>
+          <w:lang w:val="en-GB"/>
+        </w:rPr>
+        <w:t>v.fecha</w:t>
+      </w:r>
+      <w:proofErr w:type="gramEnd"/>
+    </w:p>
+    <w:p>
+      <w:pPr>
+        <w:rPr>
+          <w:lang w:val="en-GB"/>
+        </w:rPr>
+      </w:pPr>
+      <w:r>
+        <w:rPr>
+          <w:lang w:val="en-GB"/>
+        </w:rPr>
+        <w:t xml:space="preserve">ORDER BY </w:t>
+      </w:r>
+      <w:proofErr w:type="spellStart"/>
+      <w:proofErr w:type="gramStart"/>
+      <w:r>
+        <w:rPr>
+          <w:lang w:val="en-GB"/>
+        </w:rPr>
+        <w:t>v.fecha</w:t>
+      </w:r>
+      <w:proofErr w:type="spellEnd"/>
+      <w:proofErr w:type="gramEnd"/>
+      <w:r>
+        <w:rPr>
+          <w:lang w:val="en-GB"/>
+        </w:rPr>
+        <w:t>;</w:t>
+      </w:r>
+    </w:p>
+    <w:p>
+      <w:pPr>
+        <w:shd w:val="clear" w:color="auto" w:fill="E97132" w:themeFill="accent2"/>
+      </w:pPr>
+      <w:r>
+        <w:t>16.1 BORRAR DATOS</w:t>
+      </w:r>
+    </w:p>
+    <w:p>
+      <w:r>
+        <w:t xml:space="preserve">DELETE </w:t>
+      </w:r>
+      <w:proofErr w:type="gramStart"/>
+      <w:r>
+        <w:t xml:space="preserve">FROM  </w:t>
+      </w:r>
+      <w:proofErr w:type="spellStart"/>
+      <w:r>
+        <w:t>nombretable</w:t>
+      </w:r>
+      <w:proofErr w:type="spellEnd"/>
+      <w:proofErr w:type="gramEnd"/>
+      <w:r>
+        <w:t xml:space="preserve"> WHERE la </w:t>
+      </w:r>
+      <w:proofErr w:type="spellStart"/>
+      <w:r>
+        <w:t>condicion</w:t>
+      </w:r>
+      <w:proofErr w:type="spellEnd"/>
+    </w:p>
+    <w:p>
+      <w:pPr>
+        <w:rPr>
+          <w:lang w:val="en-GB"/>
+        </w:rPr>
+      </w:pPr>
+      <w:r>
+        <w:rPr>
+          <w:lang w:val="en-GB"/>
+        </w:rPr>
+        <w:t xml:space="preserve">EJEMPLO </w:t>
+      </w:r>
+    </w:p>
+    <w:p>
+      <w:pPr>
+        <w:rPr>
+          <w:lang w:val="en-GB"/>
+        </w:rPr>
+      </w:pPr>
+      <w:r>
+        <w:rPr>
+          <w:lang w:val="en-GB"/>
+        </w:rPr>
+        <w:t xml:space="preserve">DELETE FROM </w:t>
+      </w:r>
+    </w:p>
+    <w:p>
+      <w:pPr>
+        <w:rPr>
+          <w:lang w:val="en-GB"/>
+        </w:rPr>
+      </w:pPr>
+    </w:p>
+    <w:p>
+      <w:pPr>
+        <w:shd w:val="clear" w:color="auto" w:fill="E97132" w:themeFill="accent2"/>
+        <w:rPr>
+          <w:lang w:val="en-GB"/>
+        </w:rPr>
+      </w:pPr>
+      <w:r>
+        <w:rPr>
+          <w:lang w:val="en-GB"/>
+        </w:rPr>
+        <w:t>16.2 MODIFICAR DATOS</w:t>
+      </w:r>
+    </w:p>
+    <w:p>
+      <w:pPr>
+        <w:rPr>
+          <w:lang w:val="en-GB"/>
+        </w:rPr>
+      </w:pPr>
+      <w:r>
+        <w:rPr>
+          <w:lang w:val="en-GB"/>
+        </w:rPr>
+        <w:t xml:space="preserve">Update set </w:t>
+      </w:r>
+      <w:proofErr w:type="gramStart"/>
+      <w:r>
+        <w:rPr>
+          <w:lang w:val="en-GB"/>
+        </w:rPr>
+        <w:t>where</w:t>
+      </w:r>
+      <w:proofErr w:type="gramEnd"/>
+    </w:p>
+    <w:p>
+      <w:pPr>
+        <w:rPr>
+          <w:lang w:val="en-GB"/>
+        </w:rPr>
+      </w:pPr>
+      <w:r>
+        <w:rPr>
+          <w:lang w:val="en-GB"/>
+        </w:rPr>
+        <w:t xml:space="preserve">Update </w:t>
+      </w:r>
+      <w:proofErr w:type="spellStart"/>
+      <w:r>
+        <w:rPr>
+          <w:lang w:val="en-GB"/>
+        </w:rPr>
+        <w:t>nombre</w:t>
+      </w:r>
+      <w:proofErr w:type="spellEnd"/>
+      <w:r>
+        <w:rPr>
+          <w:lang w:val="en-GB"/>
+        </w:rPr>
+        <w:t xml:space="preserve"> table set columna=</w:t>
+      </w:r>
+      <w:proofErr w:type="spellStart"/>
+      <w:r>
+        <w:rPr>
+          <w:lang w:val="en-GB"/>
+        </w:rPr>
+        <w:t>valor</w:t>
+      </w:r>
+      <w:proofErr w:type="spellEnd"/>
+      <w:r>
+        <w:rPr>
+          <w:lang w:val="en-GB"/>
+        </w:rPr>
         <w:t xml:space="preserve"> </w:t>
       </w:r>
-      <w:proofErr w:type="spellStart"/>
-      <w:r>
-        <w:t>dv</w:t>
-      </w:r>
-      <w:proofErr w:type="spellEnd"/>
-      <w:r>
-        <w:t xml:space="preserve"> ON </w:t>
-      </w:r>
-      <w:proofErr w:type="spellStart"/>
-      <w:r>
-        <w:t>v.id_venta</w:t>
-      </w:r>
-      <w:proofErr w:type="spellEnd"/>
-      <w:r>
-        <w:t xml:space="preserve"> = </w:t>
-      </w:r>
-      <w:proofErr w:type="spellStart"/>
-      <w:r>
-        <w:t>dv.id_venta</w:t>
-      </w:r>
-      <w:proofErr w:type="spellEnd"/>
-    </w:p>
-    <w:p>
-      <w:pPr>
-        <w:rPr>
-          <w:lang w:val="en-GB"/>
-        </w:rPr>
-      </w:pPr>
-      <w:r>
-        <w:rPr>
-          <w:lang w:val="en-GB"/>
-        </w:rPr>
-        <w:t>GROUP BY c.id_cliente, c.nombre</w:t>
-      </w:r>
-    </w:p>
-    <w:p>
-      <w:pPr>
-        <w:rPr>
-          <w:lang w:val="en-GB"/>
-        </w:rPr>
-      </w:pPr>
-      <w:r>
-        <w:rPr>
-          <w:lang w:val="en-GB"/>
-        </w:rPr>
-        <w:t>ORDER BY gasto_total DESC</w:t>
-      </w:r>
-    </w:p>
-    <w:p>
-      <w:pPr>
-        <w:rPr>
-          <w:lang w:val="en-GB"/>
-        </w:rPr>
-      </w:pPr>
-      <w:r>
-        <w:rPr>
-          <w:lang w:val="en-GB"/>
-        </w:rPr>
-        <w:t>LIMIT 3;</w:t>
-      </w:r>
-    </w:p>
-    <w:p>
-      <w:pPr>
-        <w:rPr>
-          <w:lang w:val="en-GB"/>
-        </w:rPr>
-      </w:pPr>
-    </w:p>
-    <w:p>
-      <w:r>
-        <w:t>-- 15</w:t>
-      </w:r>
-    </w:p>
-    <w:p>
-      <w:r>
-        <w:t xml:space="preserve">SELECT </w:t>
-      </w:r>
-      <w:proofErr w:type="spellStart"/>
-      <w:r>
-        <w:t>p.id_producto</w:t>
-      </w:r>
-      <w:proofErr w:type="spellEnd"/>
-      <w:r>
-        <w:t xml:space="preserve">, </w:t>
-      </w:r>
-      <w:proofErr w:type="spellStart"/>
-      <w:r>
-        <w:t>p.nombre</w:t>
-      </w:r>
-      <w:proofErr w:type="spellEnd"/>
-      <w:r>
-        <w:t>,</w:t>
-      </w:r>
-    </w:p>
-    <w:p>
-      <w:r>
-        <w:t xml:space="preserve">       SUM(</w:t>
-      </w:r>
-      <w:proofErr w:type="spellStart"/>
-      <w:r>
-        <w:t>dv.cantidad</w:t>
-      </w:r>
-      <w:proofErr w:type="spellEnd"/>
-      <w:r>
-        <w:t xml:space="preserve">) AS </w:t>
-      </w:r>
-      <w:proofErr w:type="spellStart"/>
-      <w:r>
-        <w:t>unidades_vendidas</w:t>
-      </w:r>
-      <w:proofErr w:type="spellEnd"/>
-    </w:p>
-    <w:p>
-      <w:r>
-        <w:t>FROM productos p</w:t>
-      </w:r>
-    </w:p>
-    <w:p>
-      <w:r>
-        <w:t xml:space="preserve">JOIN </w:t>
-      </w:r>
-      <w:proofErr w:type="spellStart"/>
-      <w:r>
-        <w:t>detalle_venta</w:t>
-      </w:r>
-      <w:proofErr w:type="spellEnd"/>
-      <w:r>
-        <w:t xml:space="preserve"> </w:t>
-      </w:r>
-      <w:proofErr w:type="spellStart"/>
-      <w:r>
-        <w:t>dv</w:t>
-      </w:r>
-      <w:proofErr w:type="spellEnd"/>
-      <w:r>
-        <w:t xml:space="preserve"> ON </w:t>
-      </w:r>
-      <w:proofErr w:type="spellStart"/>
-      <w:r>
-        <w:t>p.id_producto</w:t>
-      </w:r>
-      <w:proofErr w:type="spellEnd"/>
-      <w:r>
-        <w:t xml:space="preserve"> = </w:t>
-      </w:r>
-      <w:proofErr w:type="spellStart"/>
-      <w:r>
-        <w:t>dv.id_producto</w:t>
-      </w:r>
-      <w:proofErr w:type="spellEnd"/>
-    </w:p>
-    <w:p>
-      <w:pPr>
-        <w:rPr>
-          <w:lang w:val="en-GB"/>
-        </w:rPr>
-      </w:pPr>
-      <w:r>
-        <w:rPr>
-          <w:lang w:val="en-GB"/>
-        </w:rPr>
-        <w:t xml:space="preserve">GROUP BY </w:t>
-      </w:r>
-      <w:proofErr w:type="spellStart"/>
-      <w:r>
-        <w:rPr>
-          <w:lang w:val="en-GB"/>
-        </w:rPr>
-        <w:t>p.id_producto</w:t>
-      </w:r>
-      <w:proofErr w:type="spellEnd"/>
-      <w:r>
-        <w:rPr>
-          <w:lang w:val="en-GB"/>
-        </w:rPr>
-        <w:t xml:space="preserve">, </w:t>
-      </w:r>
-      <w:proofErr w:type="spellStart"/>
-      <w:r>
-        <w:rPr>
-          <w:lang w:val="en-GB"/>
-        </w:rPr>
-        <w:t>p.nombre</w:t>
-      </w:r>
-      <w:proofErr w:type="spellEnd"/>
-    </w:p>
-    <w:p>
-      <w:r>
-        <w:t xml:space="preserve">ORDER BY </w:t>
-      </w:r>
-      <w:proofErr w:type="spellStart"/>
-      <w:r>
-        <w:t>unidades_vendidas</w:t>
-      </w:r>
-      <w:proofErr w:type="spellEnd"/>
-      <w:r>
-        <w:t xml:space="preserve"> DESC</w:t>
-      </w:r>
-    </w:p>
-    <w:p>
-      <w:r>
-        <w:t>LIMIT 3;</w:t>
-      </w:r>
-    </w:p>
-    <w:p/>
-    <w:p>
-      <w:r>
-        <w:t>-- 16</w:t>
-      </w:r>
-    </w:p>
-    <w:p>
-      <w:r>
-        <w:t xml:space="preserve">SELECT </w:t>
-      </w:r>
-      <w:proofErr w:type="spellStart"/>
-      <w:r>
-        <w:t>v.fecha</w:t>
-      </w:r>
-      <w:proofErr w:type="spellEnd"/>
-      <w:r>
-        <w:t>,</w:t>
-      </w:r>
-    </w:p>
-    <w:p>
-      <w:r>
-        <w:t xml:space="preserve">       SUM(</w:t>
-      </w:r>
-      <w:proofErr w:type="spellStart"/>
-      <w:r>
-        <w:t>dv.cantidad</w:t>
-      </w:r>
-      <w:proofErr w:type="spellEnd"/>
-      <w:r>
-        <w:t xml:space="preserve"> * </w:t>
-      </w:r>
-      <w:proofErr w:type="spellStart"/>
-      <w:r>
-        <w:t>dv.precio_unitario</w:t>
-      </w:r>
-      <w:proofErr w:type="spellEnd"/>
-      <w:r>
-        <w:t xml:space="preserve">) AS </w:t>
-      </w:r>
-      <w:proofErr w:type="spellStart"/>
-      <w:r>
-        <w:t>facturacion_dia</w:t>
-      </w:r>
-      <w:proofErr w:type="spellEnd"/>
-    </w:p>
-    <w:p>
-      <w:r>
-        <w:t>FROM ventas v</w:t>
-      </w:r>
-    </w:p>
-    <w:p>
-      <w:r>
-        <w:t xml:space="preserve">JOIN </w:t>
-      </w:r>
-      <w:proofErr w:type="spellStart"/>
-      <w:r>
-        <w:t>detalle_venta</w:t>
-      </w:r>
-      <w:proofErr w:type="spellEnd"/>
-      <w:r>
-        <w:t xml:space="preserve"> </w:t>
-      </w:r>
-      <w:proofErr w:type="spellStart"/>
-      <w:r>
-        <w:t>dv</w:t>
-      </w:r>
-      <w:proofErr w:type="spellEnd"/>
-      <w:r>
-        <w:t xml:space="preserve"> ON </w:t>
-      </w:r>
-      <w:proofErr w:type="spellStart"/>
-      <w:r>
-        <w:t>v.id_venta</w:t>
-      </w:r>
-      <w:proofErr w:type="spellEnd"/>
-      <w:r>
-        <w:t xml:space="preserve"> = </w:t>
-      </w:r>
-      <w:proofErr w:type="spellStart"/>
-      <w:r>
-        <w:t>dv.id_venta</w:t>
-      </w:r>
-      <w:proofErr w:type="spellEnd"/>
-    </w:p>
-    <w:p>
-      <w:pPr>
-        <w:rPr>
-          <w:lang w:val="en-GB"/>
-        </w:rPr>
-      </w:pPr>
-      <w:r>
-        <w:rPr>
-          <w:lang w:val="en-GB"/>
-        </w:rPr>
-        <w:lastRenderedPageBreak/>
-        <w:t>GROUP BY v.fecha</w:t>
-      </w:r>
-    </w:p>
-    <w:p>
-      <w:pPr>
-        <w:rPr>
-          <w:lang w:val="en-GB"/>
-        </w:rPr>
-      </w:pPr>
-      <w:r>
-        <w:rPr>
-          <w:lang w:val="en-GB"/>
-        </w:rPr>
-        <w:t xml:space="preserve">ORDER BY </w:t>
-      </w:r>
-      <w:proofErr w:type="spellStart"/>
-      <w:r>
-        <w:rPr>
-          <w:lang w:val="en-GB"/>
-        </w:rPr>
-        <w:t>v.fecha</w:t>
-      </w:r>
-      <w:proofErr w:type="spellEnd"/>
-      <w:r>
-        <w:rPr>
-          <w:lang w:val="en-GB"/>
-        </w:rPr>
-        <w:t>;</w:t>
-      </w:r>
-    </w:p>
-    <w:p>
-      <w:pPr>
-        <w:rPr>
-          <w:lang w:val="en-GB"/>
-        </w:rPr>
-      </w:pPr>
-      <w:r>
-        <w:rPr>
-          <w:lang w:val="en-GB"/>
-        </w:rPr>
-        <w:t>16.1 BORRAR DATOS</w:t>
-      </w:r>
-    </w:p>
-    <w:p>
-      <w:r>
-        <w:t xml:space="preserve">DELETE FROM  </w:t>
-      </w:r>
-      <w:proofErr w:type="spellStart"/>
-      <w:r>
-        <w:t>nombretable</w:t>
-      </w:r>
-      <w:proofErr w:type="spellEnd"/>
-      <w:r>
-        <w:t xml:space="preserve"> WHERE la </w:t>
-      </w:r>
-      <w:proofErr w:type="spellStart"/>
-      <w:r>
+      <w:proofErr w:type="gramStart"/>
+      <w:r>
+        <w:rPr>
+          <w:lang w:val="en-GB"/>
+        </w:rPr>
+        <w:t xml:space="preserve">where  </w:t>
+      </w:r>
+      <w:proofErr w:type="spellStart"/>
+      <w:r>
+        <w:rPr>
+          <w:lang w:val="en-GB"/>
+        </w:rPr>
         <w:t>condicion</w:t>
       </w:r>
       <w:proofErr w:type="spellEnd"/>
-    </w:p>
-    <w:p>
-      <w:r>
-        <w:t xml:space="preserve">EJEMPLO </w:t>
-      </w:r>
-    </w:p>
-    <w:p>
-      <w:pPr>
-        <w:rPr>
-          <w:lang w:val="en-GB"/>
-        </w:rPr>
-      </w:pPr>
-      <w:r>
-        <w:rPr>
-          <w:lang w:val="en-GB"/>
-        </w:rPr>
-        <w:t xml:space="preserve">DELETE FROM </w:t>
-      </w:r>
-    </w:p>
-    <w:p>
-      <w:pPr>
-        <w:rPr>
-          <w:lang w:val="en-GB"/>
-        </w:rPr>
-      </w:pPr>
-    </w:p>
-    <w:p>
-      <w:pPr>
-        <w:rPr>
-          <w:lang w:val="en-GB"/>
-        </w:rPr>
-      </w:pPr>
-      <w:r>
-        <w:rPr>
-          <w:lang w:val="en-GB"/>
-        </w:rPr>
-        <w:t>16.2 MODIFICAR DATOS</w:t>
-      </w:r>
-    </w:p>
-    <w:p>
-      <w:pPr>
-        <w:rPr>
-          <w:lang w:val="en-GB"/>
-        </w:rPr>
-      </w:pPr>
-      <w:r>
-        <w:rPr>
-          <w:lang w:val="en-GB"/>
-        </w:rPr>
-        <w:t>Update set where</w:t>
-      </w:r>
-    </w:p>
-    <w:p>
-      <w:pPr>
-        <w:rPr>
-          <w:lang w:val="en-GB"/>
-        </w:rPr>
-      </w:pPr>
-      <w:r>
-        <w:rPr>
-          <w:lang w:val="en-GB"/>
-        </w:rPr>
-        <w:t xml:space="preserve">Update </w:t>
-      </w:r>
-      <w:proofErr w:type="spellStart"/>
-      <w:r>
-        <w:rPr>
-          <w:lang w:val="en-GB"/>
-        </w:rPr>
-        <w:t>nombre</w:t>
-      </w:r>
-      <w:proofErr w:type="spellEnd"/>
-      <w:r>
-        <w:rPr>
-          <w:lang w:val="en-GB"/>
-        </w:rPr>
-        <w:t xml:space="preserve"> table set columna=</w:t>
-      </w:r>
-      <w:proofErr w:type="spellStart"/>
-      <w:r>
-        <w:rPr>
-          <w:lang w:val="en-GB"/>
-        </w:rPr>
-        <w:t>valor</w:t>
-      </w:r>
-      <w:proofErr w:type="spellEnd"/>
-      <w:r>
-        <w:rPr>
-          <w:lang w:val="en-GB"/>
-        </w:rPr>
-        <w:t xml:space="preserve"> where  </w:t>
-      </w:r>
-      <w:proofErr w:type="spellStart"/>
-      <w:r>
-        <w:rPr>
-          <w:lang w:val="en-GB"/>
-        </w:rPr>
-        <w:t>condicion</w:t>
-      </w:r>
-      <w:proofErr w:type="spellEnd"/>
+      <w:proofErr w:type="gramEnd"/>
     </w:p>
     <w:p>
       <w:pPr>
@@ -2977,6 +3654,7 @@
         <w:shd w:val="clear" w:color="auto" w:fill="FAE2D5" w:themeFill="accent2" w:themeFillTint="33"/>
       </w:pPr>
       <w:r>
+        <w:lastRenderedPageBreak/>
         <w:t>Ventas cuyo total sea superior a la media de ventas.</w:t>
       </w:r>
     </w:p>
@@ -3084,9 +3762,16 @@
         <w:rPr>
           <w:lang w:val="en-GB"/>
         </w:rPr>
-        <w:lastRenderedPageBreak/>
-        <w:t>WHERE id_cliente IN (SELECT id_cliente FROM ventas);</w:t>
-      </w:r>
+        <w:t>WHERE id_cliente IN (SELECT id_cliente FROM ventas</w:t>
+      </w:r>
+      <w:proofErr w:type="gramStart"/>
+      <w:r>
+        <w:rPr>
+          <w:lang w:val="en-GB"/>
+        </w:rPr>
+        <w:t>);</w:t>
+      </w:r>
+      <w:proofErr w:type="gramEnd"/>
     </w:p>
     <w:p>
       <w:pPr>
@@ -3149,8 +3834,16 @@
         <w:rPr>
           <w:lang w:val="en-GB"/>
         </w:rPr>
-        <w:t>WHERE id_cliente NOT IN (SELECT id_cliente FROM ventas);</w:t>
-      </w:r>
+        <w:t>WHERE id_cliente NOT IN (SELECT id_cliente FROM ventas</w:t>
+      </w:r>
+      <w:proofErr w:type="gramStart"/>
+      <w:r>
+        <w:rPr>
+          <w:lang w:val="en-GB"/>
+        </w:rPr>
+        <w:t>);</w:t>
+      </w:r>
+      <w:proofErr w:type="gramEnd"/>
     </w:p>
     <w:p>
       <w:pPr>
@@ -3213,8 +3906,16 @@
         <w:rPr>
           <w:lang w:val="en-GB"/>
         </w:rPr>
-        <w:t>WHERE id_producto IN (SELECT id_producto FROM detalle_venta);</w:t>
-      </w:r>
+        <w:t>WHERE id_producto IN (SELECT id_producto FROM detalle_venta</w:t>
+      </w:r>
+      <w:proofErr w:type="gramStart"/>
+      <w:r>
+        <w:rPr>
+          <w:lang w:val="en-GB"/>
+        </w:rPr>
+        <w:t>);</w:t>
+      </w:r>
+      <w:proofErr w:type="gramEnd"/>
     </w:p>
     <w:p>
       <w:pPr>
@@ -3277,8 +3978,16 @@
         <w:rPr>
           <w:lang w:val="en-GB"/>
         </w:rPr>
-        <w:t>WHERE id_producto NOT IN (SELECT id_producto FROM detalle_venta);</w:t>
-      </w:r>
+        <w:t>WHERE id_producto NOT IN (SELECT id_producto FROM detalle_venta</w:t>
+      </w:r>
+      <w:proofErr w:type="gramStart"/>
+      <w:r>
+        <w:rPr>
+          <w:lang w:val="en-GB"/>
+        </w:rPr>
+        <w:t>);</w:t>
+      </w:r>
+      <w:proofErr w:type="gramEnd"/>
     </w:p>
     <w:p>
       <w:pPr>
@@ -3341,8 +4050,30 @@
         <w:rPr>
           <w:lang w:val="en-GB"/>
         </w:rPr>
-        <w:t>WHERE precio &gt; (SELECT AVG(precio) FROM productos);</w:t>
-      </w:r>
+        <w:t xml:space="preserve">WHERE precio &gt; (SELECT </w:t>
+      </w:r>
+      <w:proofErr w:type="gramStart"/>
+      <w:r>
+        <w:rPr>
+          <w:lang w:val="en-GB"/>
+        </w:rPr>
+        <w:t>AVG(</w:t>
+      </w:r>
+      <w:proofErr w:type="gramEnd"/>
+      <w:r>
+        <w:rPr>
+          <w:lang w:val="en-GB"/>
+        </w:rPr>
+        <w:t>precio) FROM productos</w:t>
+      </w:r>
+      <w:proofErr w:type="gramStart"/>
+      <w:r>
+        <w:rPr>
+          <w:lang w:val="en-GB"/>
+        </w:rPr>
+        <w:t>);</w:t>
+      </w:r>
+      <w:proofErr w:type="gramEnd"/>
     </w:p>
     <w:p>
       <w:pPr>
@@ -3376,8 +4107,13 @@
         <w:t xml:space="preserve">, </w:t>
       </w:r>
       <w:proofErr w:type="spellStart"/>
-      <w:r>
-        <w:t>t.total_venta</w:t>
+      <w:proofErr w:type="gramStart"/>
+      <w:r>
+        <w:t>t.total</w:t>
+      </w:r>
+      <w:proofErr w:type="gramEnd"/>
+      <w:r>
+        <w:t>_venta</w:t>
       </w:r>
       <w:proofErr w:type="spellEnd"/>
     </w:p>
@@ -3402,7 +4138,15 @@
       </w:r>
       <w:proofErr w:type="spellEnd"/>
       <w:r>
-        <w:t xml:space="preserve">, SUM(cantidad * </w:t>
+        <w:t xml:space="preserve">, </w:t>
+      </w:r>
+      <w:proofErr w:type="gramStart"/>
+      <w:r>
+        <w:t>SUM(</w:t>
+      </w:r>
+      <w:proofErr w:type="gramEnd"/>
+      <w:r>
+        <w:t xml:space="preserve">cantidad * </w:t>
       </w:r>
       <w:proofErr w:type="spellStart"/>
       <w:r>
@@ -3454,7 +4198,6 @@
         <w:shd w:val="clear" w:color="auto" w:fill="FAE2D5" w:themeFill="accent2" w:themeFillTint="33"/>
       </w:pPr>
       <w:r>
-        <w:lastRenderedPageBreak/>
         <w:t>) t</w:t>
       </w:r>
     </w:p>
@@ -3466,8 +4209,13 @@
         <w:t xml:space="preserve">WHERE </w:t>
       </w:r>
       <w:proofErr w:type="spellStart"/>
-      <w:r>
-        <w:t>t.total_venta</w:t>
+      <w:proofErr w:type="gramStart"/>
+      <w:r>
+        <w:t>t.total</w:t>
+      </w:r>
+      <w:proofErr w:type="gramEnd"/>
+      <w:r>
+        <w:t>_venta</w:t>
       </w:r>
       <w:proofErr w:type="spellEnd"/>
       <w:r>
@@ -3482,8 +4230,13 @@
         <w:t xml:space="preserve">  SELECT AVG(</w:t>
       </w:r>
       <w:proofErr w:type="spellStart"/>
-      <w:r>
-        <w:t>x.total_venta</w:t>
+      <w:proofErr w:type="gramStart"/>
+      <w:r>
+        <w:t>x.total</w:t>
+      </w:r>
+      <w:proofErr w:type="gramEnd"/>
+      <w:r>
+        <w:t>_venta</w:t>
       </w:r>
       <w:proofErr w:type="spellEnd"/>
       <w:r>
@@ -3511,7 +4264,15 @@
       </w:r>
       <w:proofErr w:type="spellEnd"/>
       <w:r>
-        <w:t xml:space="preserve">, SUM(cantidad * </w:t>
+        <w:t xml:space="preserve">, </w:t>
+      </w:r>
+      <w:proofErr w:type="gramStart"/>
+      <w:r>
+        <w:t>SUM(</w:t>
+      </w:r>
+      <w:proofErr w:type="gramEnd"/>
+      <w:r>
+        <w:t xml:space="preserve">cantidad * </w:t>
       </w:r>
       <w:proofErr w:type="spellStart"/>
       <w:r>
@@ -3609,16 +4370,23 @@
         <w:t xml:space="preserve">, </w:t>
       </w:r>
       <w:proofErr w:type="spellStart"/>
+      <w:proofErr w:type="gramStart"/>
       <w:r>
         <w:t>c.nombre</w:t>
       </w:r>
       <w:proofErr w:type="spellEnd"/>
+      <w:proofErr w:type="gramEnd"/>
       <w:r>
         <w:t xml:space="preserve">, </w:t>
       </w:r>
       <w:proofErr w:type="spellStart"/>
-      <w:r>
-        <w:t>tot.gasto_total</w:t>
+      <w:proofErr w:type="gramStart"/>
+      <w:r>
+        <w:t>tot.gasto</w:t>
+      </w:r>
+      <w:proofErr w:type="gramEnd"/>
+      <w:r>
+        <w:t>_total</w:t>
       </w:r>
       <w:proofErr w:type="spellEnd"/>
     </w:p>
@@ -3651,19 +4419,29 @@
       </w:r>
       <w:proofErr w:type="spellEnd"/>
       <w:r>
-        <w:t>, SUM(</w:t>
+        <w:t xml:space="preserve">, </w:t>
+      </w:r>
+      <w:proofErr w:type="gramStart"/>
+      <w:r>
+        <w:t>SUM(</w:t>
       </w:r>
       <w:proofErr w:type="spellStart"/>
       <w:r>
         <w:t>dv.cantidad</w:t>
       </w:r>
       <w:proofErr w:type="spellEnd"/>
+      <w:proofErr w:type="gramEnd"/>
       <w:r>
         <w:t xml:space="preserve"> * </w:t>
       </w:r>
       <w:proofErr w:type="spellStart"/>
-      <w:r>
-        <w:t>dv.precio_unitario</w:t>
+      <w:proofErr w:type="gramStart"/>
+      <w:r>
+        <w:t>dv.precio</w:t>
+      </w:r>
+      <w:proofErr w:type="gramEnd"/>
+      <w:r>
+        <w:t>_unitario</w:t>
       </w:r>
       <w:proofErr w:type="spellEnd"/>
       <w:r>
@@ -3748,21 +4526,49 @@
         <w:rPr>
           <w:lang w:val="en-GB"/>
         </w:rPr>
-        <w:t>) tot ON c.id_cliente = tot.id_cliente</w:t>
-      </w:r>
-    </w:p>
-    <w:p>
-      <w:pPr>
-        <w:shd w:val="clear" w:color="auto" w:fill="FAE2D5" w:themeFill="accent2" w:themeFillTint="33"/>
-        <w:rPr>
-          <w:lang w:val="en-GB"/>
-        </w:rPr>
-      </w:pPr>
-      <w:r>
-        <w:rPr>
-          <w:lang w:val="en-GB"/>
-        </w:rPr>
-        <w:t>ORDER BY tot.gasto_total DESC</w:t>
+        <w:t xml:space="preserve">) </w:t>
+      </w:r>
+      <w:proofErr w:type="gramStart"/>
+      <w:r>
+        <w:rPr>
+          <w:lang w:val="en-GB"/>
+        </w:rPr>
+        <w:t>tot</w:t>
+      </w:r>
+      <w:proofErr w:type="gramEnd"/>
+      <w:r>
+        <w:rPr>
+          <w:lang w:val="en-GB"/>
+        </w:rPr>
+        <w:t xml:space="preserve"> ON c.id_cliente = tot.id_cliente</w:t>
+      </w:r>
+    </w:p>
+    <w:p>
+      <w:pPr>
+        <w:shd w:val="clear" w:color="auto" w:fill="FAE2D5" w:themeFill="accent2" w:themeFillTint="33"/>
+        <w:rPr>
+          <w:lang w:val="en-GB"/>
+        </w:rPr>
+      </w:pPr>
+      <w:r>
+        <w:rPr>
+          <w:lang w:val="en-GB"/>
+        </w:rPr>
+        <w:t xml:space="preserve">ORDER BY </w:t>
+      </w:r>
+      <w:proofErr w:type="gramStart"/>
+      <w:r>
+        <w:rPr>
+          <w:lang w:val="en-GB"/>
+        </w:rPr>
+        <w:t>tot.gasto</w:t>
+      </w:r>
+      <w:proofErr w:type="gramEnd"/>
+      <w:r>
+        <w:rPr>
+          <w:lang w:val="en-GB"/>
+        </w:rPr>
+        <w:t>_total DESC</w:t>
       </w:r>
     </w:p>
     <w:p>
@@ -3791,8 +4597,13 @@
         <w:shd w:val="clear" w:color="auto" w:fill="FAE2D5" w:themeFill="accent2" w:themeFillTint="33"/>
       </w:pPr>
       <w:r>
-        <w:t>SELECT DISTINCT p2.nombre</w:t>
-      </w:r>
+        <w:t>SELECT DISTINCT p</w:t>
+      </w:r>
+      <w:proofErr w:type="gramStart"/>
+      <w:r>
+        <w:t>2.nombre</w:t>
+      </w:r>
+      <w:proofErr w:type="gramEnd"/>
     </w:p>
     <w:p>
       <w:pPr>
@@ -3844,7 +4655,6 @@
         <w:shd w:val="clear" w:color="auto" w:fill="FAE2D5" w:themeFill="accent2" w:themeFillTint="33"/>
       </w:pPr>
       <w:r>
-        <w:lastRenderedPageBreak/>
         <w:t xml:space="preserve">  FROM </w:t>
       </w:r>
       <w:proofErr w:type="spellStart"/>
@@ -3889,7 +4699,21 @@
         <w:rPr>
           <w:lang w:val="en-GB"/>
         </w:rPr>
-        <w:t xml:space="preserve">  WHERE p.nombre = 'iPhone 13'</w:t>
+        <w:t xml:space="preserve">  WHERE </w:t>
+      </w:r>
+      <w:proofErr w:type="gramStart"/>
+      <w:r>
+        <w:rPr>
+          <w:lang w:val="en-GB"/>
+        </w:rPr>
+        <w:t>p.nombre</w:t>
+      </w:r>
+      <w:proofErr w:type="gramEnd"/>
+      <w:r>
+        <w:rPr>
+          <w:lang w:val="en-GB"/>
+        </w:rPr>
+        <w:t xml:space="preserve"> = 'iPhone 13'</w:t>
       </w:r>
     </w:p>
     <w:p>

</xml_diff>